<commit_message>
docs(corpus): E2E traceability overlays + ASPICE planning stubs TMS-007/008/009
- Spec docs 04-10: upstream verifies tables, FSR-004 section, DSN
  allocation, stub test specs, evidence limits (hand-maintained
  overlays; renderer divergence recorded in reproducibility-report)
- New blocked-status stubs: TMS-007 integration, TMS-008
  qualification, TMS-009 validation (draft, zero executions)
- Links LNK-039..047 (verifies/validates) in both registries;
  mirror backfilled LNK-022..038
- SWE.4/5/6 renamed to PAM 4.0 titles; reports synced to 65
  artifacts + 65 links; exports + DOCX 04-10 rebuilt
- corpus check PASSED (89 validated, 0 errors); coverage 65/65
</commit_message>
<xml_diff>
--- a/docs/artifacts/spec-documents/04-software-requirements-specification.docx
+++ b/docs/artifacts/spec-documents/04-software-requirements-specification.docx
@@ -23,7 +23,7 @@
         <w:pStyle w:val="Date"/>
       </w:pPr>
       <w:r>
-        <w:t xml:space="preserve">2026-09-13</w:t>
+        <w:t xml:space="preserve">2026-09-18</w:t>
       </w:r>
     </w:p>
     <w:sdt>
@@ -52,7 +52,7 @@
         </w:p>
       </w:sdtContent>
     </w:sdt>
-    <w:bookmarkStart w:id="44" w:name="Xfe7bed4e53f5e4573dd961ca6e61ce47e865d29"/>
+    <w:bookmarkStart w:id="52" w:name="Xfe7bed4e53f5e4573dd961ca6e61ce47e865d29"/>
     <w:p>
       <w:pPr>
         <w:pStyle w:val="Heading1"/>
@@ -3276,7 +3276,7 @@
     <w:bookmarkEnd w:id="29"/>
     <w:bookmarkEnd w:id="30"/>
     <w:bookmarkEnd w:id="31"/>
-    <w:bookmarkStart w:id="43" w:name="profile-synthetic_reference"/>
+    <w:bookmarkStart w:id="46" w:name="profile-synthetic_reference"/>
     <w:p>
       <w:pPr>
         <w:pStyle w:val="Heading2"/>
@@ -5265,16 +5265,648 @@
     </w:p>
     <w:bookmarkEnd w:id="39"/>
     <w:bookmarkEnd w:id="40"/>
-    <w:bookmarkStart w:id="42" w:name="X2d267b6394db0e3b3a7e8bdbd05de8a02bc579a"/>
+    <w:bookmarkStart w:id="43" w:name="X052d68f92a1e4ff2484b00dfd7fa751e9e64896"/>
     <w:p>
       <w:pPr>
         <w:pStyle w:val="Heading3"/>
       </w:pPr>
       <w:r>
+        <w:t xml:space="preserve">Parent FSR:</w:t>
+      </w:r>
+      <w:r>
+        <w:t xml:space="preserve"> </w:t>
+      </w:r>
+      <w:r>
+        <w:rPr>
+          <w:rStyle w:val="VerbatimChar"/>
+        </w:rPr>
+        <w:t xml:space="preserve">FB2-SAF-FSR-000004</w:t>
+      </w:r>
+      <w:r>
+        <w:t xml:space="preserve"> </w:t>
+      </w:r>
+      <w:r>
+        <w:t xml:space="preserve">(</w:t>
+      </w:r>
+      <w:r>
+        <w:rPr>
+          <w:rStyle w:val="VerbatimChar"/>
+        </w:rPr>
+        <w:t xml:space="preserve">synthetic_reference</w:t>
+      </w:r>
+      <w:r>
+        <w:t xml:space="preserve"> </w:t>
+      </w:r>
+      <w:r>
+        <w:t xml:space="preserve">only — no</w:t>
+      </w:r>
+      <w:r>
+        <w:t xml:space="preserve"> </w:t>
+      </w:r>
+      <w:r>
+        <w:rPr>
+          <w:rStyle w:val="VerbatimChar"/>
+        </w:rPr>
+        <w:t xml:space="preserve">as_is</w:t>
+      </w:r>
+      <w:r>
+        <w:t xml:space="preserve"> </w:t>
+      </w:r>
+      <w:r>
+        <w:t xml:space="preserve">record)</w:t>
+      </w:r>
+    </w:p>
+    <w:bookmarkStart w:id="41" w:name="X1e068cba80621b3927f829aa568058ba8a41039"/>
+    <w:p>
+      <w:pPr>
+        <w:pStyle w:val="Heading4"/>
+      </w:pPr>
+      <w:r>
+        <w:rPr>
+          <w:rStyle w:val="VerbatimChar"/>
+        </w:rPr>
+        <w:t xml:space="preserve">FB2-SAF-FSR-000004</w:t>
+      </w:r>
+      <w:r>
+        <w:t xml:space="preserve"> </w:t>
+      </w:r>
+      <w:r>
+        <w:t xml:space="preserve">— FSR: Independent Hardware Voltage Monitor</w:t>
+      </w:r>
+    </w:p>
+    <w:p>
+      <w:pPr>
+        <w:pStyle w:val="Compact"/>
+        <w:numPr>
+          <w:ilvl w:val="0"/>
+          <w:numId w:val="1025"/>
+        </w:numPr>
+      </w:pPr>
+      <w:r>
+        <w:rPr>
+          <w:b/>
+          <w:bCs/>
+        </w:rPr>
+        <w:t xml:space="preserve">Refines</w:t>
+      </w:r>
+      <w:r>
+        <w:t xml:space="preserve">:</w:t>
+      </w:r>
+      <w:r>
+        <w:t xml:space="preserve"> </w:t>
+      </w:r>
+      <w:r>
+        <w:rPr>
+          <w:rStyle w:val="VerbatimChar"/>
+        </w:rPr>
+        <w:t xml:space="preserve">FB2-SAF-SGO-000001</w:t>
+      </w:r>
+      <w:r>
+        <w:t xml:space="preserve"> </w:t>
+      </w:r>
+      <w:r>
+        <w:t xml:space="preserve">(link</w:t>
+      </w:r>
+      <w:r>
+        <w:t xml:space="preserve"> </w:t>
+      </w:r>
+      <w:r>
+        <w:rPr>
+          <w:rStyle w:val="VerbatimChar"/>
+        </w:rPr>
+        <w:t xml:space="preserve">FB2-LNK-SAF-000021</w:t>
+      </w:r>
+      <w:r>
+        <w:t xml:space="preserve">, rationale:</w:t>
+      </w:r>
+      <w:r>
+        <w:t xml:space="preserve"> </w:t>
+      </w:r>
+      <w:r>
+        <w:t xml:space="preserve">“</w:t>
+      </w:r>
+      <w:r>
+        <w:t xml:space="preserve">FSR refines safety goal into functional requirement</w:t>
+      </w:r>
+      <w:r>
+        <w:t xml:space="preserve">”</w:t>
+      </w:r>
+      <w:r>
+        <w:t xml:space="preserve">)</w:t>
+      </w:r>
+    </w:p>
+    <w:p>
+      <w:pPr>
+        <w:pStyle w:val="Compact"/>
+        <w:numPr>
+          <w:ilvl w:val="0"/>
+          <w:numId w:val="1025"/>
+        </w:numPr>
+      </w:pPr>
+      <w:r>
+        <w:rPr>
+          <w:b/>
+          <w:bCs/>
+        </w:rPr>
+        <w:t xml:space="preserve">Statement</w:t>
+      </w:r>
+      <w:r>
+        <w:t xml:space="preserve">: The BMS shall include an independent hardware voltage monitor (ASIL B) that continuously monitors cell voltages and can open HV contactors independently of the main MCU within 50 ms of overvoltage detection.</w:t>
+      </w:r>
+    </w:p>
+    <w:p>
+      <w:pPr>
+        <w:pStyle w:val="Compact"/>
+        <w:numPr>
+          <w:ilvl w:val="0"/>
+          <w:numId w:val="1025"/>
+        </w:numPr>
+      </w:pPr>
+      <w:r>
+        <w:rPr>
+          <w:b/>
+          <w:bCs/>
+        </w:rPr>
+        <w:t xml:space="preserve">Rationale</w:t>
+      </w:r>
+      <w:r>
+        <w:t xml:space="preserve">: Provides freedom from interference for ASIL D safety goal; addresses timing budget violation in main path (115 ms &gt; 100 ms FTTI) by providing parallel safety channel</w:t>
+      </w:r>
+    </w:p>
+    <w:p>
+      <w:pPr>
+        <w:pStyle w:val="Compact"/>
+        <w:numPr>
+          <w:ilvl w:val="0"/>
+          <w:numId w:val="1025"/>
+        </w:numPr>
+      </w:pPr>
+      <w:r>
+        <w:rPr>
+          <w:b/>
+          <w:bCs/>
+        </w:rPr>
+        <w:t xml:space="preserve">Classification</w:t>
+      </w:r>
+      <w:r>
+        <w:t xml:space="preserve">:</w:t>
+      </w:r>
+      <w:r>
+        <w:t xml:space="preserve"> </w:t>
+      </w:r>
+      <w:r>
+        <w:rPr>
+          <w:rStyle w:val="VerbatimChar"/>
+        </w:rPr>
+        <w:t xml:space="preserve">safety</w:t>
+      </w:r>
+    </w:p>
+    <w:p>
+      <w:pPr>
+        <w:pStyle w:val="Compact"/>
+        <w:numPr>
+          <w:ilvl w:val="0"/>
+          <w:numId w:val="1025"/>
+        </w:numPr>
+      </w:pPr>
+      <w:r>
+        <w:rPr>
+          <w:b/>
+          <w:bCs/>
+        </w:rPr>
+        <w:t xml:space="preserve">ASIL</w:t>
+      </w:r>
+      <w:r>
+        <w:t xml:space="preserve">:</w:t>
+      </w:r>
+      <w:r>
+        <w:t xml:space="preserve"> </w:t>
+      </w:r>
+      <w:r>
+        <w:rPr>
+          <w:rStyle w:val="VerbatimChar"/>
+        </w:rPr>
+        <w:t xml:space="preserve">ASIL_B</w:t>
+      </w:r>
+    </w:p>
+    <w:p>
+      <w:pPr>
+        <w:pStyle w:val="Compact"/>
+        <w:numPr>
+          <w:ilvl w:val="0"/>
+          <w:numId w:val="1025"/>
+        </w:numPr>
+      </w:pPr>
+      <w:r>
+        <w:rPr>
+          <w:b/>
+          <w:bCs/>
+        </w:rPr>
+        <w:t xml:space="preserve">Acceptance criteria</w:t>
+      </w:r>
+      <w:r>
+        <w:t xml:space="preserve">:</w:t>
+      </w:r>
+    </w:p>
+    <w:p>
+      <w:pPr>
+        <w:pStyle w:val="Compact"/>
+        <w:numPr>
+          <w:ilvl w:val="1"/>
+          <w:numId w:val="1026"/>
+        </w:numPr>
+      </w:pPr>
+      <w:r>
+        <w:t xml:space="preserve">Independent detection latency: Time from overvoltage to contactor command ≤ 50 ms</w:t>
+      </w:r>
+    </w:p>
+    <w:p>
+      <w:pPr>
+        <w:pStyle w:val="Compact"/>
+        <w:numPr>
+          <w:ilvl w:val="1"/>
+          <w:numId w:val="1026"/>
+        </w:numPr>
+      </w:pPr>
+      <w:r>
+        <w:t xml:space="preserve">Independence: No shared MCU, power supply, or communication with main path ≤ 100% %</w:t>
+      </w:r>
+    </w:p>
+    <w:p>
+      <w:pPr>
+        <w:pStyle w:val="Compact"/>
+        <w:numPr>
+          <w:ilvl w:val="1"/>
+          <w:numId w:val="1026"/>
+        </w:numPr>
+      </w:pPr>
+      <w:r>
+        <w:t xml:space="preserve">Monitoring coverage: Cells monitored ≤ All cells (or representative subset &gt;= 50%) %</w:t>
+      </w:r>
+    </w:p>
+    <w:p>
+      <w:pPr>
+        <w:pStyle w:val="Compact"/>
+        <w:numPr>
+          <w:ilvl w:val="1"/>
+          <w:numId w:val="1026"/>
+        </w:numPr>
+      </w:pPr>
+      <w:r>
+        <w:t xml:space="preserve">Threshold accuracy: Overvoltage threshold accuracy ≤ 50 mV</w:t>
+      </w:r>
+    </w:p>
+    <w:p>
+      <w:pPr>
+        <w:pStyle w:val="Compact"/>
+        <w:numPr>
+          <w:ilvl w:val="0"/>
+          <w:numId w:val="1025"/>
+        </w:numPr>
+      </w:pPr>
+      <w:r>
+        <w:rPr>
+          <w:b/>
+          <w:bCs/>
+        </w:rPr>
+        <w:t xml:space="preserve">Assumption references</w:t>
+      </w:r>
+      <w:r>
+        <w:t xml:space="preserve">:</w:t>
+      </w:r>
+      <w:r>
+        <w:t xml:space="preserve"> </w:t>
+      </w:r>
+      <w:r>
+        <w:rPr>
+          <w:rStyle w:val="VerbatimChar"/>
+        </w:rPr>
+        <w:t xml:space="preserve">FB2-ASM-008</w:t>
+      </w:r>
+    </w:p>
+    <w:bookmarkEnd w:id="41"/>
+    <w:bookmarkStart w:id="42" w:name="Xabc5344f6eada92d16d76050362aecd62a4caff"/>
+    <w:p>
+      <w:pPr>
+        <w:pStyle w:val="Heading4"/>
+      </w:pPr>
+      <w:r>
+        <w:rPr>
+          <w:rStyle w:val="VerbatimChar"/>
+        </w:rPr>
+        <w:t xml:space="preserve">FB2-HW-TSR-000004</w:t>
+      </w:r>
+      <w:r>
+        <w:t xml:space="preserve"> </w:t>
+      </w:r>
+      <w:r>
+        <w:t xml:space="preserve">— TSR: Independent Hardware Voltage Monitor</w:t>
+      </w:r>
+    </w:p>
+    <w:p>
+      <w:pPr>
+        <w:pStyle w:val="Compact"/>
+        <w:numPr>
+          <w:ilvl w:val="0"/>
+          <w:numId w:val="1027"/>
+        </w:numPr>
+      </w:pPr>
+      <w:r>
+        <w:rPr>
+          <w:b/>
+          <w:bCs/>
+        </w:rPr>
+        <w:t xml:space="preserve">Statement</w:t>
+      </w:r>
+      <w:r>
+        <w:t xml:space="preserve">: The BMS shall include an independent hardware voltage monitor (ASIL B) that continuously monitors cell voltages and can open HV contactors independently of the main MCU within 50 ms of overvoltage detection.</w:t>
+      </w:r>
+    </w:p>
+    <w:p>
+      <w:pPr>
+        <w:pStyle w:val="Compact"/>
+        <w:numPr>
+          <w:ilvl w:val="0"/>
+          <w:numId w:val="1027"/>
+        </w:numPr>
+      </w:pPr>
+      <w:r>
+        <w:rPr>
+          <w:b/>
+          <w:bCs/>
+        </w:rPr>
+        <w:t xml:space="preserve">Rationale</w:t>
+      </w:r>
+      <w:r>
+        <w:t xml:space="preserve">: Provides freedom from interference for ASIL D safety goal; addresses timing budget violation in main path (115 ms &gt; 100 ms FTTI) by providing parallel safety channel</w:t>
+      </w:r>
+    </w:p>
+    <w:p>
+      <w:pPr>
+        <w:pStyle w:val="Compact"/>
+        <w:numPr>
+          <w:ilvl w:val="0"/>
+          <w:numId w:val="1027"/>
+        </w:numPr>
+      </w:pPr>
+      <w:r>
+        <w:rPr>
+          <w:b/>
+          <w:bCs/>
+        </w:rPr>
+        <w:t xml:space="preserve">Classification</w:t>
+      </w:r>
+      <w:r>
+        <w:t xml:space="preserve">:</w:t>
+      </w:r>
+      <w:r>
+        <w:t xml:space="preserve"> </w:t>
+      </w:r>
+      <w:r>
+        <w:rPr>
+          <w:rStyle w:val="VerbatimChar"/>
+        </w:rPr>
+        <w:t xml:space="preserve">safety</w:t>
+      </w:r>
+    </w:p>
+    <w:p>
+      <w:pPr>
+        <w:pStyle w:val="Compact"/>
+        <w:numPr>
+          <w:ilvl w:val="0"/>
+          <w:numId w:val="1027"/>
+        </w:numPr>
+      </w:pPr>
+      <w:r>
+        <w:rPr>
+          <w:b/>
+          <w:bCs/>
+        </w:rPr>
+        <w:t xml:space="preserve">ASIL</w:t>
+      </w:r>
+      <w:r>
+        <w:t xml:space="preserve">:</w:t>
+      </w:r>
+      <w:r>
+        <w:t xml:space="preserve"> </w:t>
+      </w:r>
+      <w:r>
+        <w:rPr>
+          <w:rStyle w:val="VerbatimChar"/>
+        </w:rPr>
+        <w:t xml:space="preserve">ASIL_B</w:t>
+      </w:r>
+    </w:p>
+    <w:p>
+      <w:pPr>
+        <w:pStyle w:val="Compact"/>
+        <w:numPr>
+          <w:ilvl w:val="0"/>
+          <w:numId w:val="1027"/>
+        </w:numPr>
+      </w:pPr>
+      <w:r>
+        <w:rPr>
+          <w:b/>
+          <w:bCs/>
+        </w:rPr>
+        <w:t xml:space="preserve">Acceptance criteria</w:t>
+      </w:r>
+      <w:r>
+        <w:t xml:space="preserve">:</w:t>
+      </w:r>
+    </w:p>
+    <w:p>
+      <w:pPr>
+        <w:pStyle w:val="Compact"/>
+        <w:numPr>
+          <w:ilvl w:val="1"/>
+          <w:numId w:val="1028"/>
+        </w:numPr>
+      </w:pPr>
+      <w:r>
+        <w:t xml:space="preserve">Independent detection latency: Time from overvoltage to contactor command ≤ 50 ms</w:t>
+      </w:r>
+    </w:p>
+    <w:p>
+      <w:pPr>
+        <w:pStyle w:val="Compact"/>
+        <w:numPr>
+          <w:ilvl w:val="1"/>
+          <w:numId w:val="1028"/>
+        </w:numPr>
+      </w:pPr>
+      <w:r>
+        <w:t xml:space="preserve">Independence: No shared MCU, power supply, or communication with main path ≤ 100% %</w:t>
+      </w:r>
+    </w:p>
+    <w:p>
+      <w:pPr>
+        <w:pStyle w:val="Compact"/>
+        <w:numPr>
+          <w:ilvl w:val="1"/>
+          <w:numId w:val="1028"/>
+        </w:numPr>
+      </w:pPr>
+      <w:r>
+        <w:t xml:space="preserve">Monitoring coverage: Cells monitored ≤ All cells (or representative subset &gt;= 50%) %</w:t>
+      </w:r>
+    </w:p>
+    <w:p>
+      <w:pPr>
+        <w:pStyle w:val="Compact"/>
+        <w:numPr>
+          <w:ilvl w:val="1"/>
+          <w:numId w:val="1028"/>
+        </w:numPr>
+      </w:pPr>
+      <w:r>
+        <w:t xml:space="preserve">Threshold accuracy: Overvoltage threshold accuracy ≤ 50 mV</w:t>
+      </w:r>
+    </w:p>
+    <w:p>
+      <w:pPr>
+        <w:pStyle w:val="Compact"/>
+        <w:numPr>
+          <w:ilvl w:val="0"/>
+          <w:numId w:val="1027"/>
+        </w:numPr>
+      </w:pPr>
+      <w:r>
+        <w:rPr>
+          <w:b/>
+          <w:bCs/>
+        </w:rPr>
+        <w:t xml:space="preserve">Assumption references</w:t>
+      </w:r>
+      <w:r>
+        <w:t xml:space="preserve">:</w:t>
+      </w:r>
+      <w:r>
+        <w:t xml:space="preserve"> </w:t>
+      </w:r>
+      <w:r>
+        <w:rPr>
+          <w:rStyle w:val="VerbatimChar"/>
+        </w:rPr>
+        <w:t xml:space="preserve">FB2-ASM-008</w:t>
+      </w:r>
+    </w:p>
+    <w:p>
+      <w:pPr>
+        <w:pStyle w:val="Compact"/>
+        <w:numPr>
+          <w:ilvl w:val="0"/>
+          <w:numId w:val="1027"/>
+        </w:numPr>
+      </w:pPr>
+      <w:r>
+        <w:rPr>
+          <w:b/>
+          <w:bCs/>
+        </w:rPr>
+        <w:t xml:space="preserve">Note</w:t>
+      </w:r>
+      <w:r>
+        <w:t xml:space="preserve">: no</w:t>
+      </w:r>
+      <w:r>
+        <w:t xml:space="preserve"> </w:t>
+      </w:r>
+      <w:r>
+        <w:rPr>
+          <w:rStyle w:val="VerbatimChar"/>
+        </w:rPr>
+        <w:t xml:space="preserve">allocated_to</w:t>
+      </w:r>
+      <w:r>
+        <w:t xml:space="preserve"> </w:t>
+      </w:r>
+      <w:r>
+        <w:t xml:space="preserve">link from</w:t>
+      </w:r>
+      <w:r>
+        <w:t xml:space="preserve"> </w:t>
+      </w:r>
+      <w:r>
+        <w:rPr>
+          <w:rStyle w:val="VerbatimChar"/>
+        </w:rPr>
+        <w:t xml:space="preserve">FB2-HW-TSR-000004</w:t>
+      </w:r>
+      <w:r>
+        <w:t xml:space="preserve"> </w:t>
+      </w:r>
+      <w:r>
+        <w:t xml:space="preserve">to</w:t>
+      </w:r>
+      <w:r>
+        <w:t xml:space="preserve"> </w:t>
+      </w:r>
+      <w:r>
+        <w:rPr>
+          <w:rStyle w:val="VerbatimChar"/>
+        </w:rPr>
+        <w:t xml:space="preserve">FB2-SAF-FSR-000004</w:t>
+      </w:r>
+      <w:r>
+        <w:t xml:space="preserve"> </w:t>
+      </w:r>
+      <w:r>
+        <w:t xml:space="preserve">exists in the link registry; both are verified by</w:t>
+      </w:r>
+      <w:r>
+        <w:t xml:space="preserve"> </w:t>
+      </w:r>
+      <w:r>
+        <w:rPr>
+          <w:rStyle w:val="VerbatimChar"/>
+        </w:rPr>
+        <w:t xml:space="preserve">FB2-VER-TMS-000004</w:t>
+      </w:r>
+      <w:r>
+        <w:t xml:space="preserve"> </w:t>
+      </w:r>
+      <w:r>
+        <w:t xml:space="preserve">(links</w:t>
+      </w:r>
+      <w:r>
+        <w:t xml:space="preserve"> </w:t>
+      </w:r>
+      <w:r>
+        <w:rPr>
+          <w:rStyle w:val="VerbatimChar"/>
+        </w:rPr>
+        <w:t xml:space="preserve">FB2-LNK-SAF-000029</w:t>
+      </w:r>
+      <w:r>
+        <w:t xml:space="preserve">,</w:t>
+      </w:r>
+      <w:r>
+        <w:t xml:space="preserve"> </w:t>
+      </w:r>
+      <w:r>
+        <w:rPr>
+          <w:rStyle w:val="VerbatimChar"/>
+        </w:rPr>
+        <w:t xml:space="preserve">FB2-LNK-SAF-000030</w:t>
+      </w:r>
+      <w:r>
+        <w:t xml:space="preserve">).</w:t>
+      </w:r>
+    </w:p>
+    <w:bookmarkEnd w:id="42"/>
+    <w:bookmarkEnd w:id="43"/>
+    <w:bookmarkStart w:id="45" w:name="X2d267b6394db0e3b3a7e8bdbd05de8a02bc579a"/>
+    <w:p>
+      <w:pPr>
+        <w:pStyle w:val="Heading3"/>
+      </w:pPr>
+      <w:r>
         <w:t xml:space="preserve">Software Requirements Without Parent FSR Link</w:t>
       </w:r>
     </w:p>
-    <w:bookmarkStart w:id="41" w:name="X1086518f1b29501d8c6c8a0637ce1d975122977"/>
+    <w:bookmarkStart w:id="44" w:name="X1086518f1b29501d8c6c8a0637ce1d975122977"/>
     <w:p>
       <w:pPr>
         <w:pStyle w:val="Heading4"/>
@@ -5297,7 +5929,7 @@
         <w:pStyle w:val="Compact"/>
         <w:numPr>
           <w:ilvl w:val="0"/>
-          <w:numId w:val="1025"/>
+          <w:numId w:val="1029"/>
         </w:numPr>
       </w:pPr>
       <w:r>
@@ -5316,7 +5948,7 @@
         <w:pStyle w:val="Compact"/>
         <w:numPr>
           <w:ilvl w:val="0"/>
-          <w:numId w:val="1025"/>
+          <w:numId w:val="1029"/>
         </w:numPr>
       </w:pPr>
       <w:r>
@@ -5372,7 +6004,7 @@
         <w:pStyle w:val="Compact"/>
         <w:numPr>
           <w:ilvl w:val="0"/>
-          <w:numId w:val="1025"/>
+          <w:numId w:val="1029"/>
         </w:numPr>
       </w:pPr>
       <w:r>
@@ -5399,6 +6031,2491 @@
       </w:r>
       <w:r>
         <w:t xml:space="preserve">link to a parent FSR in this profile’s registry.</w:t>
+      </w:r>
+    </w:p>
+    <w:bookmarkEnd w:id="44"/>
+    <w:bookmarkEnd w:id="45"/>
+    <w:bookmarkEnd w:id="46"/>
+    <w:bookmarkStart w:id="47" w:name="upstream-traceability"/>
+    <w:p>
+      <w:pPr>
+        <w:pStyle w:val="Heading2"/>
+      </w:pPr>
+      <w:r>
+        <w:t xml:space="preserve">Upstream Traceability</w:t>
+      </w:r>
+    </w:p>
+    <w:p>
+      <w:pPr>
+        <w:pStyle w:val="FirstParagraph"/>
+      </w:pPr>
+      <w:r>
+        <w:t xml:space="preserve">Full chain hazard → safety goal → FSR. Link IDs identical in both profiles except</w:t>
+      </w:r>
+      <w:r>
+        <w:t xml:space="preserve"> </w:t>
+      </w:r>
+      <w:r>
+        <w:rPr>
+          <w:rStyle w:val="VerbatimChar"/>
+        </w:rPr>
+        <w:t xml:space="preserve">FB2-SAF-FSR-000004</w:t>
+      </w:r>
+      <w:r>
+        <w:t xml:space="preserve"> </w:t>
+      </w:r>
+      <w:r>
+        <w:t xml:space="preserve">(</w:t>
+      </w:r>
+      <w:r>
+        <w:rPr>
+          <w:rStyle w:val="VerbatimChar"/>
+        </w:rPr>
+        <w:t xml:space="preserve">synthetic_reference</w:t>
+      </w:r>
+      <w:r>
+        <w:t xml:space="preserve"> </w:t>
+      </w:r>
+      <w:r>
+        <w:t xml:space="preserve">only).</w:t>
+      </w:r>
+    </w:p>
+    <w:tbl>
+      <w:tblPr>
+        <w:tblStyle w:val="Table"/>
+        <w:tblW w:type="pct" w:w="5000"/>
+        <w:jc w:val="left"/>
+        <w:tblLayout w:type="fixed"/>
+        <w:tblLook w:firstRow="1" w:lastRow="0" w:firstColumn="0" w:lastColumn="0" w:noHBand="0" w:noVBand="0" w:val="0020"/>
+      </w:tblPr>
+      <w:tblGrid>
+        <w:gridCol w:w="2640"/>
+        <w:gridCol w:w="2640"/>
+        <w:gridCol w:w="2640"/>
+      </w:tblGrid>
+      <w:tr>
+        <w:trPr>
+          <w:tblHeader w:val="on"/>
+        </w:trPr>
+        <w:tc>
+          <w:tcPr/>
+          <w:p>
+            <w:pPr>
+              <w:pStyle w:val="Compact"/>
+              <w:jc w:val="left"/>
+            </w:pPr>
+            <w:r>
+              <w:t xml:space="preserve">Child</w:t>
+            </w:r>
+          </w:p>
+        </w:tc>
+        <w:tc>
+          <w:tcPr/>
+          <w:p>
+            <w:pPr>
+              <w:pStyle w:val="Compact"/>
+              <w:jc w:val="left"/>
+            </w:pPr>
+            <w:r>
+              <w:t xml:space="preserve">Relation</w:t>
+            </w:r>
+          </w:p>
+        </w:tc>
+        <w:tc>
+          <w:tcPr/>
+          <w:p>
+            <w:pPr>
+              <w:pStyle w:val="Compact"/>
+              <w:jc w:val="left"/>
+            </w:pPr>
+            <w:r>
+              <w:t xml:space="preserve">Parent</w:t>
+            </w:r>
+          </w:p>
+        </w:tc>
+      </w:tr>
+      <w:tr>
+        <w:tc>
+          <w:tcPr/>
+          <w:p>
+            <w:pPr>
+              <w:pStyle w:val="Compact"/>
+              <w:jc w:val="left"/>
+            </w:pPr>
+            <w:r>
+              <w:rPr>
+                <w:rStyle w:val="VerbatimChar"/>
+              </w:rPr>
+              <w:t xml:space="preserve">FB2-SAF-SGO-000001</w:t>
+            </w:r>
+          </w:p>
+        </w:tc>
+        <w:tc>
+          <w:tcPr/>
+          <w:p>
+            <w:pPr>
+              <w:pStyle w:val="Compact"/>
+              <w:jc w:val="left"/>
+            </w:pPr>
+            <w:r>
+              <w:rPr>
+                <w:rStyle w:val="VerbatimChar"/>
+              </w:rPr>
+              <w:t xml:space="preserve">mitigates</w:t>
+            </w:r>
+            <w:r>
+              <w:t xml:space="preserve"> </w:t>
+            </w:r>
+            <w:r>
+              <w:rPr>
+                <w:rStyle w:val="VerbatimChar"/>
+              </w:rPr>
+              <w:t xml:space="preserve">FB2-SAF-HAZ-000001</w:t>
+            </w:r>
+            <w:r>
+              <w:t xml:space="preserve"> </w:t>
+            </w:r>
+            <w:r>
+              <w:t xml:space="preserve">(</w:t>
+            </w:r>
+            <w:r>
+              <w:rPr>
+                <w:rStyle w:val="VerbatimChar"/>
+              </w:rPr>
+              <w:t xml:space="preserve">FB2-LNK-SAF-000001</w:t>
+            </w:r>
+            <w:r>
+              <w:t xml:space="preserve">)</w:t>
+            </w:r>
+          </w:p>
+        </w:tc>
+        <w:tc>
+          <w:tcPr/>
+          <w:p>
+            <w:pPr>
+              <w:pStyle w:val="Compact"/>
+              <w:jc w:val="left"/>
+            </w:pPr>
+            <w:r>
+              <w:rPr>
+                <w:rStyle w:val="VerbatimChar"/>
+              </w:rPr>
+              <w:t xml:space="preserve">FB2-SAF-HAZ-000001</w:t>
+            </w:r>
+          </w:p>
+        </w:tc>
+      </w:tr>
+      <w:tr>
+        <w:tc>
+          <w:tcPr/>
+          <w:p>
+            <w:pPr>
+              <w:pStyle w:val="Compact"/>
+              <w:jc w:val="left"/>
+            </w:pPr>
+            <w:r>
+              <w:rPr>
+                <w:rStyle w:val="VerbatimChar"/>
+              </w:rPr>
+              <w:t xml:space="preserve">FB2-SAF-FSR-000001</w:t>
+            </w:r>
+          </w:p>
+        </w:tc>
+        <w:tc>
+          <w:tcPr/>
+          <w:p>
+            <w:pPr>
+              <w:pStyle w:val="Compact"/>
+              <w:jc w:val="left"/>
+            </w:pPr>
+            <w:r>
+              <w:rPr>
+                <w:rStyle w:val="VerbatimChar"/>
+              </w:rPr>
+              <w:t xml:space="preserve">refines</w:t>
+            </w:r>
+            <w:r>
+              <w:t xml:space="preserve"> </w:t>
+            </w:r>
+            <w:r>
+              <w:t xml:space="preserve">(</w:t>
+            </w:r>
+            <w:r>
+              <w:rPr>
+                <w:rStyle w:val="VerbatimChar"/>
+              </w:rPr>
+              <w:t xml:space="preserve">FB2-LNK-SAF-000002</w:t>
+            </w:r>
+            <w:r>
+              <w:t xml:space="preserve">)</w:t>
+            </w:r>
+          </w:p>
+        </w:tc>
+        <w:tc>
+          <w:tcPr/>
+          <w:p>
+            <w:pPr>
+              <w:pStyle w:val="Compact"/>
+              <w:jc w:val="left"/>
+            </w:pPr>
+            <w:r>
+              <w:rPr>
+                <w:rStyle w:val="VerbatimChar"/>
+              </w:rPr>
+              <w:t xml:space="preserve">FB2-SAF-SGO-000001</w:t>
+            </w:r>
+          </w:p>
+        </w:tc>
+      </w:tr>
+      <w:tr>
+        <w:tc>
+          <w:tcPr/>
+          <w:p>
+            <w:pPr>
+              <w:pStyle w:val="Compact"/>
+              <w:jc w:val="left"/>
+            </w:pPr>
+            <w:r>
+              <w:rPr>
+                <w:rStyle w:val="VerbatimChar"/>
+              </w:rPr>
+              <w:t xml:space="preserve">FB2-SAF-FSR-000002</w:t>
+            </w:r>
+          </w:p>
+        </w:tc>
+        <w:tc>
+          <w:tcPr/>
+          <w:p>
+            <w:pPr>
+              <w:pStyle w:val="Compact"/>
+              <w:jc w:val="left"/>
+            </w:pPr>
+            <w:r>
+              <w:rPr>
+                <w:rStyle w:val="VerbatimChar"/>
+              </w:rPr>
+              <w:t xml:space="preserve">refines</w:t>
+            </w:r>
+            <w:r>
+              <w:t xml:space="preserve"> </w:t>
+            </w:r>
+            <w:r>
+              <w:t xml:space="preserve">(</w:t>
+            </w:r>
+            <w:r>
+              <w:rPr>
+                <w:rStyle w:val="VerbatimChar"/>
+              </w:rPr>
+              <w:t xml:space="preserve">FB2-LNK-SAF-000003</w:t>
+            </w:r>
+            <w:r>
+              <w:t xml:space="preserve">)</w:t>
+            </w:r>
+          </w:p>
+        </w:tc>
+        <w:tc>
+          <w:tcPr/>
+          <w:p>
+            <w:pPr>
+              <w:pStyle w:val="Compact"/>
+              <w:jc w:val="left"/>
+            </w:pPr>
+            <w:r>
+              <w:rPr>
+                <w:rStyle w:val="VerbatimChar"/>
+              </w:rPr>
+              <w:t xml:space="preserve">FB2-SAF-SGO-000001</w:t>
+            </w:r>
+          </w:p>
+        </w:tc>
+      </w:tr>
+      <w:tr>
+        <w:tc>
+          <w:tcPr/>
+          <w:p>
+            <w:pPr>
+              <w:pStyle w:val="Compact"/>
+              <w:jc w:val="left"/>
+            </w:pPr>
+            <w:r>
+              <w:rPr>
+                <w:rStyle w:val="VerbatimChar"/>
+              </w:rPr>
+              <w:t xml:space="preserve">FB2-SAF-FSR-000003</w:t>
+            </w:r>
+          </w:p>
+        </w:tc>
+        <w:tc>
+          <w:tcPr/>
+          <w:p>
+            <w:pPr>
+              <w:pStyle w:val="Compact"/>
+              <w:jc w:val="left"/>
+            </w:pPr>
+            <w:r>
+              <w:rPr>
+                <w:rStyle w:val="VerbatimChar"/>
+              </w:rPr>
+              <w:t xml:space="preserve">refines</w:t>
+            </w:r>
+            <w:r>
+              <w:t xml:space="preserve"> </w:t>
+            </w:r>
+            <w:r>
+              <w:t xml:space="preserve">(</w:t>
+            </w:r>
+            <w:r>
+              <w:rPr>
+                <w:rStyle w:val="VerbatimChar"/>
+              </w:rPr>
+              <w:t xml:space="preserve">FB2-LNK-SAF-000004</w:t>
+            </w:r>
+            <w:r>
+              <w:t xml:space="preserve">)</w:t>
+            </w:r>
+          </w:p>
+        </w:tc>
+        <w:tc>
+          <w:tcPr/>
+          <w:p>
+            <w:pPr>
+              <w:pStyle w:val="Compact"/>
+              <w:jc w:val="left"/>
+            </w:pPr>
+            <w:r>
+              <w:rPr>
+                <w:rStyle w:val="VerbatimChar"/>
+              </w:rPr>
+              <w:t xml:space="preserve">FB2-SAF-SGO-000001</w:t>
+            </w:r>
+          </w:p>
+        </w:tc>
+      </w:tr>
+      <w:tr>
+        <w:tc>
+          <w:tcPr/>
+          <w:p>
+            <w:pPr>
+              <w:pStyle w:val="Compact"/>
+              <w:jc w:val="left"/>
+            </w:pPr>
+            <w:r>
+              <w:rPr>
+                <w:rStyle w:val="VerbatimChar"/>
+              </w:rPr>
+              <w:t xml:space="preserve">FB2-SAF-FSR-000004</w:t>
+            </w:r>
+            <w:r>
+              <w:t xml:space="preserve"> </w:t>
+            </w:r>
+            <w:r>
+              <w:t xml:space="preserve">(</w:t>
+            </w:r>
+            <w:r>
+              <w:rPr>
+                <w:rStyle w:val="VerbatimChar"/>
+              </w:rPr>
+              <w:t xml:space="preserve">synthetic_reference</w:t>
+            </w:r>
+            <w:r>
+              <w:t xml:space="preserve"> </w:t>
+            </w:r>
+            <w:r>
+              <w:t xml:space="preserve">only)</w:t>
+            </w:r>
+          </w:p>
+        </w:tc>
+        <w:tc>
+          <w:tcPr/>
+          <w:p>
+            <w:pPr>
+              <w:pStyle w:val="Compact"/>
+              <w:jc w:val="left"/>
+            </w:pPr>
+            <w:r>
+              <w:rPr>
+                <w:rStyle w:val="VerbatimChar"/>
+              </w:rPr>
+              <w:t xml:space="preserve">refines</w:t>
+            </w:r>
+            <w:r>
+              <w:t xml:space="preserve"> </w:t>
+            </w:r>
+            <w:r>
+              <w:t xml:space="preserve">(</w:t>
+            </w:r>
+            <w:r>
+              <w:rPr>
+                <w:rStyle w:val="VerbatimChar"/>
+              </w:rPr>
+              <w:t xml:space="preserve">FB2-LNK-SAF-000021</w:t>
+            </w:r>
+            <w:r>
+              <w:t xml:space="preserve">)</w:t>
+            </w:r>
+          </w:p>
+        </w:tc>
+        <w:tc>
+          <w:tcPr/>
+          <w:p>
+            <w:pPr>
+              <w:pStyle w:val="Compact"/>
+              <w:jc w:val="left"/>
+            </w:pPr>
+            <w:r>
+              <w:rPr>
+                <w:rStyle w:val="VerbatimChar"/>
+              </w:rPr>
+              <w:t xml:space="preserve">FB2-SAF-SGO-000001</w:t>
+            </w:r>
+          </w:p>
+        </w:tc>
+      </w:tr>
+    </w:tbl>
+    <w:p>
+      <w:pPr>
+        <w:pStyle w:val="BodyText"/>
+      </w:pPr>
+      <w:r>
+        <w:t xml:space="preserve">Review coverage (</w:t>
+      </w:r>
+      <w:r>
+        <w:rPr>
+          <w:rStyle w:val="VerbatimChar"/>
+        </w:rPr>
+        <w:t xml:space="preserve">as_is</w:t>
+      </w:r>
+      <w:r>
+        <w:t xml:space="preserve"> </w:t>
+      </w:r>
+      <w:r>
+        <w:t xml:space="preserve">only, no review links recorded in</w:t>
+      </w:r>
+      <w:r>
+        <w:t xml:space="preserve"> </w:t>
+      </w:r>
+      <w:r>
+        <w:rPr>
+          <w:rStyle w:val="VerbatimChar"/>
+        </w:rPr>
+        <w:t xml:space="preserve">synthetic_reference</w:t>
+      </w:r>
+      <w:r>
+        <w:t xml:space="preserve">):</w:t>
+      </w:r>
+      <w:r>
+        <w:t xml:space="preserve"> </w:t>
+      </w:r>
+      <w:r>
+        <w:rPr>
+          <w:rStyle w:val="VerbatimChar"/>
+        </w:rPr>
+        <w:t xml:space="preserve">FB2-REV-000001</w:t>
+      </w:r>
+      <w:r>
+        <w:t xml:space="preserve"> </w:t>
+      </w:r>
+      <w:r>
+        <w:rPr>
+          <w:rStyle w:val="VerbatimChar"/>
+        </w:rPr>
+        <w:t xml:space="preserve">reviewed_by</w:t>
+      </w:r>
+      <w:r>
+        <w:t xml:space="preserve"> </w:t>
+      </w:r>
+      <w:r>
+        <w:rPr>
+          <w:rStyle w:val="VerbatimChar"/>
+        </w:rPr>
+        <w:t xml:space="preserve">FB2-SAF-HAZ-000001</w:t>
+      </w:r>
+      <w:r>
+        <w:t xml:space="preserve"> </w:t>
+      </w:r>
+      <w:r>
+        <w:t xml:space="preserve">(</w:t>
+      </w:r>
+      <w:r>
+        <w:rPr>
+          <w:rStyle w:val="VerbatimChar"/>
+        </w:rPr>
+        <w:t xml:space="preserve">FB2-LNK-SAF-000019</w:t>
+      </w:r>
+      <w:r>
+        <w:t xml:space="preserve">) and</w:t>
+      </w:r>
+      <w:r>
+        <w:t xml:space="preserve"> </w:t>
+      </w:r>
+      <w:r>
+        <w:rPr>
+          <w:rStyle w:val="VerbatimChar"/>
+        </w:rPr>
+        <w:t xml:space="preserve">FB2-SAF-FSR-000001</w:t>
+      </w:r>
+      <w:r>
+        <w:t xml:space="preserve"> </w:t>
+      </w:r>
+      <w:r>
+        <w:t xml:space="preserve">(</w:t>
+      </w:r>
+      <w:r>
+        <w:rPr>
+          <w:rStyle w:val="VerbatimChar"/>
+        </w:rPr>
+        <w:t xml:space="preserve">FB2-LNK-SAF-000020</w:t>
+      </w:r>
+      <w:r>
+        <w:t xml:space="preserve">).</w:t>
+      </w:r>
+    </w:p>
+    <w:bookmarkEnd w:id="47"/>
+    <w:bookmarkStart w:id="51" w:name="requirements-verification-traceability"/>
+    <w:p>
+      <w:pPr>
+        <w:pStyle w:val="Heading2"/>
+      </w:pPr>
+      <w:r>
+        <w:t xml:space="preserve">Requirements Verification Traceability</w:t>
+      </w:r>
+    </w:p>
+    <w:p>
+      <w:pPr>
+        <w:pStyle w:val="FirstParagraph"/>
+      </w:pPr>
+      <w:r>
+        <w:t xml:space="preserve">Test-measure (</w:t>
+      </w:r>
+      <w:r>
+        <w:rPr>
+          <w:rStyle w:val="VerbatimChar"/>
+        </w:rPr>
+        <w:t xml:space="preserve">verifies</w:t>
+      </w:r>
+      <w:r>
+        <w:t xml:space="preserve">) and execution (</w:t>
+      </w:r>
+      <w:r>
+        <w:rPr>
+          <w:rStyle w:val="VerbatimChar"/>
+        </w:rPr>
+        <w:t xml:space="preserve">result_of</w:t>
+      </w:r>
+      <w:r>
+        <w:t xml:space="preserve">) links per profile. A linked test measure records verification intent; only an execution record with retained, checkable evidence confers execution credit.</w:t>
+      </w:r>
+    </w:p>
+    <w:bookmarkStart w:id="48" w:name="X0074f109bec7b1d99187a7c249db14985dae0c1"/>
+    <w:p>
+      <w:pPr>
+        <w:pStyle w:val="Heading3"/>
+      </w:pPr>
+      <w:r>
+        <w:t xml:space="preserve">Profile:</w:t>
+      </w:r>
+      <w:r>
+        <w:t xml:space="preserve"> </w:t>
+      </w:r>
+      <w:r>
+        <w:rPr>
+          <w:rStyle w:val="VerbatimChar"/>
+        </w:rPr>
+        <w:t xml:space="preserve">as_is</w:t>
+      </w:r>
+      <w:r>
+        <w:t xml:space="preserve"> </w:t>
+      </w:r>
+      <w:r>
+        <w:t xml:space="preserve">(test measures</w:t>
+      </w:r>
+      <w:r>
+        <w:t xml:space="preserve"> </w:t>
+      </w:r>
+      <w:r>
+        <w:rPr>
+          <w:rStyle w:val="VerbatimChar"/>
+        </w:rPr>
+        <w:t xml:space="preserve">source_grounded</w:t>
+      </w:r>
+      <w:r>
+        <w:t xml:space="preserve">)</w:t>
+      </w:r>
+    </w:p>
+    <w:tbl>
+      <w:tblPr>
+        <w:tblStyle w:val="Table"/>
+        <w:tblW w:type="pct" w:w="5000"/>
+        <w:jc w:val="left"/>
+        <w:tblLayout w:type="fixed"/>
+        <w:tblLook w:firstRow="1" w:lastRow="0" w:firstColumn="0" w:lastColumn="0" w:noHBand="0" w:noVBand="0" w:val="0020"/>
+      </w:tblPr>
+      <w:tblGrid>
+        <w:gridCol w:w="1980"/>
+        <w:gridCol w:w="1980"/>
+        <w:gridCol w:w="1980"/>
+        <w:gridCol w:w="1980"/>
+      </w:tblGrid>
+      <w:tr>
+        <w:trPr>
+          <w:tblHeader w:val="on"/>
+        </w:trPr>
+        <w:tc>
+          <w:tcPr/>
+          <w:p>
+            <w:pPr>
+              <w:pStyle w:val="Compact"/>
+              <w:jc w:val="left"/>
+            </w:pPr>
+            <w:r>
+              <w:t xml:space="preserve">SWR / TSR</w:t>
+            </w:r>
+          </w:p>
+        </w:tc>
+        <w:tc>
+          <w:tcPr/>
+          <w:p>
+            <w:pPr>
+              <w:pStyle w:val="Compact"/>
+              <w:jc w:val="left"/>
+            </w:pPr>
+            <w:r>
+              <w:t xml:space="preserve">Allocated to</w:t>
+            </w:r>
+          </w:p>
+        </w:tc>
+        <w:tc>
+          <w:tcPr/>
+          <w:p>
+            <w:pPr>
+              <w:pStyle w:val="Compact"/>
+              <w:jc w:val="left"/>
+            </w:pPr>
+            <w:r>
+              <w:t xml:space="preserve">Test measure (</w:t>
+            </w:r>
+            <w:r>
+              <w:rPr>
+                <w:rStyle w:val="VerbatimChar"/>
+              </w:rPr>
+              <w:t xml:space="preserve">verifies</w:t>
+            </w:r>
+            <w:r>
+              <w:t xml:space="preserve"> </w:t>
+            </w:r>
+            <w:r>
+              <w:t xml:space="preserve">links)</w:t>
+            </w:r>
+          </w:p>
+        </w:tc>
+        <w:tc>
+          <w:tcPr/>
+          <w:p>
+            <w:pPr>
+              <w:pStyle w:val="Compact"/>
+              <w:jc w:val="left"/>
+            </w:pPr>
+            <w:r>
+              <w:t xml:space="preserve">Execution record</w:t>
+            </w:r>
+          </w:p>
+        </w:tc>
+      </w:tr>
+      <w:tr>
+        <w:tc>
+          <w:tcPr/>
+          <w:p>
+            <w:pPr>
+              <w:pStyle w:val="Compact"/>
+              <w:jc w:val="left"/>
+            </w:pPr>
+            <w:r>
+              <w:rPr>
+                <w:rStyle w:val="VerbatimChar"/>
+              </w:rPr>
+              <w:t xml:space="preserve">FB2-SW-SWR-000001</w:t>
+            </w:r>
+          </w:p>
+        </w:tc>
+        <w:tc>
+          <w:tcPr/>
+          <w:p>
+            <w:pPr>
+              <w:pStyle w:val="Compact"/>
+              <w:jc w:val="left"/>
+            </w:pPr>
+            <w:r>
+              <w:rPr>
+                <w:rStyle w:val="VerbatimChar"/>
+              </w:rPr>
+              <w:t xml:space="preserve">FB2-SAF-FSR-000001</w:t>
+            </w:r>
+            <w:r>
+              <w:t xml:space="preserve"> </w:t>
+            </w:r>
+            <w:r>
+              <w:t xml:space="preserve">(</w:t>
+            </w:r>
+            <w:r>
+              <w:rPr>
+                <w:rStyle w:val="VerbatimChar"/>
+              </w:rPr>
+              <w:t xml:space="preserve">FB2-LNK-SAF-000008</w:t>
+            </w:r>
+            <w:r>
+              <w:t xml:space="preserve">)</w:t>
+            </w:r>
+          </w:p>
+        </w:tc>
+        <w:tc>
+          <w:tcPr/>
+          <w:p>
+            <w:pPr>
+              <w:pStyle w:val="Compact"/>
+              <w:jc w:val="left"/>
+            </w:pPr>
+            <w:r>
+              <w:rPr>
+                <w:rStyle w:val="VerbatimChar"/>
+              </w:rPr>
+              <w:t xml:space="preserve">FB2-VER-TMS-000003</w:t>
+            </w:r>
+            <w:r>
+              <w:t xml:space="preserve"> </w:t>
+            </w:r>
+            <w:r>
+              <w:t xml:space="preserve">(</w:t>
+            </w:r>
+            <w:r>
+              <w:rPr>
+                <w:rStyle w:val="VerbatimChar"/>
+              </w:rPr>
+              <w:t xml:space="preserve">FB2-LNK-SAF-000021</w:t>
+            </w:r>
+            <w:r>
+              <w:t xml:space="preserve">,</w:t>
+            </w:r>
+            <w:r>
+              <w:t xml:space="preserve"> </w:t>
+            </w:r>
+            <w:r>
+              <w:rPr>
+                <w:rStyle w:val="VerbatimChar"/>
+              </w:rPr>
+              <w:t xml:space="preserve">FB2-LNK-SAF-000022</w:t>
+            </w:r>
+            <w:r>
+              <w:t xml:space="preserve">)</w:t>
+            </w:r>
+          </w:p>
+        </w:tc>
+        <w:tc>
+          <w:tcPr/>
+          <w:p>
+            <w:pPr>
+              <w:pStyle w:val="Compact"/>
+              <w:jc w:val="left"/>
+            </w:pPr>
+            <w:r>
+              <w:t xml:space="preserve">none recorded</w:t>
+            </w:r>
+          </w:p>
+        </w:tc>
+      </w:tr>
+      <w:tr>
+        <w:tc>
+          <w:tcPr/>
+          <w:p>
+            <w:pPr>
+              <w:pStyle w:val="Compact"/>
+              <w:jc w:val="left"/>
+            </w:pPr>
+            <w:r>
+              <w:rPr>
+                <w:rStyle w:val="VerbatimChar"/>
+              </w:rPr>
+              <w:t xml:space="preserve">FB2-SW-SWR-000002</w:t>
+            </w:r>
+          </w:p>
+        </w:tc>
+        <w:tc>
+          <w:tcPr/>
+          <w:p>
+            <w:pPr>
+              <w:pStyle w:val="Compact"/>
+              <w:jc w:val="left"/>
+            </w:pPr>
+            <w:r>
+              <w:rPr>
+                <w:rStyle w:val="VerbatimChar"/>
+              </w:rPr>
+              <w:t xml:space="preserve">FB2-SAF-FSR-000002</w:t>
+            </w:r>
+            <w:r>
+              <w:t xml:space="preserve"> </w:t>
+            </w:r>
+            <w:r>
+              <w:t xml:space="preserve">(</w:t>
+            </w:r>
+            <w:r>
+              <w:rPr>
+                <w:rStyle w:val="VerbatimChar"/>
+              </w:rPr>
+              <w:t xml:space="preserve">FB2-LNK-SAF-000009</w:t>
+            </w:r>
+            <w:r>
+              <w:t xml:space="preserve">)</w:t>
+            </w:r>
+          </w:p>
+        </w:tc>
+        <w:tc>
+          <w:tcPr/>
+          <w:p>
+            <w:pPr>
+              <w:pStyle w:val="Compact"/>
+              <w:jc w:val="left"/>
+            </w:pPr>
+            <w:r>
+              <w:rPr>
+                <w:rStyle w:val="VerbatimChar"/>
+              </w:rPr>
+              <w:t xml:space="preserve">FB2-VER-TMS-000001</w:t>
+            </w:r>
+            <w:r>
+              <w:t xml:space="preserve"> </w:t>
+            </w:r>
+            <w:r>
+              <w:t xml:space="preserve">(</w:t>
+            </w:r>
+            <w:r>
+              <w:rPr>
+                <w:rStyle w:val="VerbatimChar"/>
+              </w:rPr>
+              <w:t xml:space="preserve">FB2-LNK-SAF-000014</w:t>
+            </w:r>
+            <w:r>
+              <w:t xml:space="preserve">,</w:t>
+            </w:r>
+            <w:r>
+              <w:t xml:space="preserve"> </w:t>
+            </w:r>
+            <w:r>
+              <w:rPr>
+                <w:rStyle w:val="VerbatimChar"/>
+              </w:rPr>
+              <w:t xml:space="preserve">FB2-LNK-SAF-000015</w:t>
+            </w:r>
+            <w:r>
+              <w:t xml:space="preserve">)</w:t>
+            </w:r>
+          </w:p>
+        </w:tc>
+        <w:tc>
+          <w:tcPr/>
+          <w:p>
+            <w:pPr>
+              <w:pStyle w:val="Compact"/>
+              <w:jc w:val="left"/>
+            </w:pPr>
+            <w:r>
+              <w:rPr>
+                <w:rStyle w:val="VerbatimChar"/>
+              </w:rPr>
+              <w:t xml:space="preserve">FB2-VER-EXE-000001</w:t>
+            </w:r>
+            <w:r>
+              <w:t xml:space="preserve"> </w:t>
+            </w:r>
+            <w:r>
+              <w:t xml:space="preserve">(</w:t>
+            </w:r>
+            <w:r>
+              <w:rPr>
+                <w:rStyle w:val="VerbatimChar"/>
+              </w:rPr>
+              <w:t xml:space="preserve">FB2-LNK-SAF-000018</w:t>
+            </w:r>
+            <w:r>
+              <w:t xml:space="preserve">),</w:t>
+            </w:r>
+            <w:r>
+              <w:t xml:space="preserve"> </w:t>
+            </w:r>
+            <w:r>
+              <w:rPr>
+                <w:rStyle w:val="VerbatimChar"/>
+              </w:rPr>
+              <w:t xml:space="preserve">actual_host_run</w:t>
+            </w:r>
+            <w:r>
+              <w:t xml:space="preserve">,</w:t>
+            </w:r>
+            <w:r>
+              <w:t xml:space="preserve"> </w:t>
+            </w:r>
+            <w:r>
+              <w:rPr>
+                <w:rStyle w:val="VerbatimChar"/>
+              </w:rPr>
+              <w:t xml:space="preserve">pass</w:t>
+            </w:r>
+            <w:r>
+              <w:t xml:space="preserve"> </w:t>
+            </w:r>
+            <w:r>
+              <w:t xml:space="preserve">— log/coverage hashes are</w:t>
+            </w:r>
+            <w:r>
+              <w:t xml:space="preserve"> </w:t>
+            </w:r>
+            <w:r>
+              <w:rPr>
+                <w:rStyle w:val="VerbatimChar"/>
+              </w:rPr>
+              <w:t xml:space="preserve">sha256:placeholder</w:t>
+            </w:r>
+            <w:r>
+              <w:t xml:space="preserve">,</w:t>
+            </w:r>
+            <w:r>
+              <w:t xml:space="preserve"> </w:t>
+            </w:r>
+            <w:r>
+              <w:rPr>
+                <w:rStyle w:val="VerbatimChar"/>
+              </w:rPr>
+              <w:t xml:space="preserve">output_hashes</w:t>
+            </w:r>
+            <w:r>
+              <w:t xml:space="preserve"> </w:t>
+            </w:r>
+            <w:r>
+              <w:t xml:space="preserve">empty, per-run logs not retained</w:t>
+            </w:r>
+          </w:p>
+        </w:tc>
+      </w:tr>
+      <w:tr>
+        <w:tc>
+          <w:tcPr/>
+          <w:p>
+            <w:pPr>
+              <w:pStyle w:val="Compact"/>
+              <w:jc w:val="left"/>
+            </w:pPr>
+            <w:r>
+              <w:rPr>
+                <w:rStyle w:val="VerbatimChar"/>
+              </w:rPr>
+              <w:t xml:space="preserve">FB2-SW-SWR-000003</w:t>
+            </w:r>
+          </w:p>
+        </w:tc>
+        <w:tc>
+          <w:tcPr/>
+          <w:p>
+            <w:pPr>
+              <w:pStyle w:val="Compact"/>
+              <w:jc w:val="left"/>
+            </w:pPr>
+            <w:r>
+              <w:rPr>
+                <w:rStyle w:val="VerbatimChar"/>
+              </w:rPr>
+              <w:t xml:space="preserve">FB2-SAF-FSR-000003</w:t>
+            </w:r>
+            <w:r>
+              <w:t xml:space="preserve"> </w:t>
+            </w:r>
+            <w:r>
+              <w:t xml:space="preserve">(</w:t>
+            </w:r>
+            <w:r>
+              <w:rPr>
+                <w:rStyle w:val="VerbatimChar"/>
+              </w:rPr>
+              <w:t xml:space="preserve">FB2-LNK-SAF-000010</w:t>
+            </w:r>
+            <w:r>
+              <w:t xml:space="preserve">)</w:t>
+            </w:r>
+          </w:p>
+        </w:tc>
+        <w:tc>
+          <w:tcPr/>
+          <w:p>
+            <w:pPr>
+              <w:pStyle w:val="Compact"/>
+              <w:jc w:val="left"/>
+            </w:pPr>
+            <w:r>
+              <w:rPr>
+                <w:rStyle w:val="VerbatimChar"/>
+              </w:rPr>
+              <w:t xml:space="preserve">FB2-VER-TMS-000002</w:t>
+            </w:r>
+            <w:r>
+              <w:t xml:space="preserve"> </w:t>
+            </w:r>
+            <w:r>
+              <w:t xml:space="preserve">(</w:t>
+            </w:r>
+            <w:r>
+              <w:rPr>
+                <w:rStyle w:val="VerbatimChar"/>
+              </w:rPr>
+              <w:t xml:space="preserve">FB2-LNK-SAF-000016</w:t>
+            </w:r>
+            <w:r>
+              <w:t xml:space="preserve">,</w:t>
+            </w:r>
+            <w:r>
+              <w:t xml:space="preserve"> </w:t>
+            </w:r>
+            <w:r>
+              <w:rPr>
+                <w:rStyle w:val="VerbatimChar"/>
+              </w:rPr>
+              <w:t xml:space="preserve">FB2-LNK-SAF-000017</w:t>
+            </w:r>
+            <w:r>
+              <w:t xml:space="preserve">)</w:t>
+            </w:r>
+          </w:p>
+        </w:tc>
+        <w:tc>
+          <w:tcPr/>
+          <w:p>
+            <w:pPr>
+              <w:pStyle w:val="Compact"/>
+              <w:jc w:val="left"/>
+            </w:pPr>
+            <w:r>
+              <w:t xml:space="preserve">none recorded</w:t>
+            </w:r>
+          </w:p>
+        </w:tc>
+      </w:tr>
+      <w:tr>
+        <w:tc>
+          <w:tcPr/>
+          <w:p>
+            <w:pPr>
+              <w:pStyle w:val="Compact"/>
+              <w:jc w:val="left"/>
+            </w:pPr>
+            <w:r>
+              <w:rPr>
+                <w:rStyle w:val="VerbatimChar"/>
+              </w:rPr>
+              <w:t xml:space="preserve">FB2-HW-TSR-000001</w:t>
+            </w:r>
+            <w:r>
+              <w:t xml:space="preserve"> </w:t>
+            </w:r>
+            <w:r>
+              <w:t xml:space="preserve">/</w:t>
+            </w:r>
+            <w:r>
+              <w:t xml:space="preserve"> </w:t>
+            </w:r>
+            <w:r>
+              <w:rPr>
+                <w:rStyle w:val="VerbatimChar"/>
+              </w:rPr>
+              <w:t xml:space="preserve">FB2-HW-TSR-000002</w:t>
+            </w:r>
+          </w:p>
+        </w:tc>
+        <w:tc>
+          <w:tcPr/>
+          <w:p>
+            <w:pPr>
+              <w:pStyle w:val="Compact"/>
+              <w:jc w:val="left"/>
+            </w:pPr>
+            <w:r>
+              <w:rPr>
+                <w:rStyle w:val="VerbatimChar"/>
+              </w:rPr>
+              <w:t xml:space="preserve">FB2-SAF-FSR-000001</w:t>
+            </w:r>
+            <w:r>
+              <w:t xml:space="preserve"> </w:t>
+            </w:r>
+            <w:r>
+              <w:t xml:space="preserve">(</w:t>
+            </w:r>
+            <w:r>
+              <w:rPr>
+                <w:rStyle w:val="VerbatimChar"/>
+              </w:rPr>
+              <w:t xml:space="preserve">FB2-LNK-SAF-000005</w:t>
+            </w:r>
+            <w:r>
+              <w:t xml:space="preserve">,</w:t>
+            </w:r>
+            <w:r>
+              <w:t xml:space="preserve"> </w:t>
+            </w:r>
+            <w:r>
+              <w:rPr>
+                <w:rStyle w:val="VerbatimChar"/>
+              </w:rPr>
+              <w:t xml:space="preserve">FB2-LNK-SAF-000006</w:t>
+            </w:r>
+            <w:r>
+              <w:t xml:space="preserve">)</w:t>
+            </w:r>
+          </w:p>
+        </w:tc>
+        <w:tc>
+          <w:tcPr/>
+          <w:p>
+            <w:pPr>
+              <w:pStyle w:val="Compact"/>
+              <w:jc w:val="left"/>
+            </w:pPr>
+            <w:r>
+              <w:rPr>
+                <w:rStyle w:val="VerbatimChar"/>
+              </w:rPr>
+              <w:t xml:space="preserve">FB2-VER-TMS-000004</w:t>
+            </w:r>
+            <w:r>
+              <w:t xml:space="preserve"> </w:t>
+            </w:r>
+            <w:r>
+              <w:t xml:space="preserve">(</w:t>
+            </w:r>
+            <w:r>
+              <w:rPr>
+                <w:rStyle w:val="VerbatimChar"/>
+              </w:rPr>
+              <w:t xml:space="preserve">FB2-LNK-SAF-000023</w:t>
+            </w:r>
+            <w:r>
+              <w:t xml:space="preserve">,</w:t>
+            </w:r>
+            <w:r>
+              <w:t xml:space="preserve"> </w:t>
+            </w:r>
+            <w:r>
+              <w:rPr>
+                <w:rStyle w:val="VerbatimChar"/>
+              </w:rPr>
+              <w:t xml:space="preserve">FB2-LNK-SAF-000024</w:t>
+            </w:r>
+            <w:r>
+              <w:t xml:space="preserve">)</w:t>
+            </w:r>
+          </w:p>
+        </w:tc>
+        <w:tc>
+          <w:tcPr/>
+          <w:p>
+            <w:pPr>
+              <w:pStyle w:val="Compact"/>
+              <w:jc w:val="left"/>
+            </w:pPr>
+            <w:r>
+              <w:t xml:space="preserve">none recorded</w:t>
+            </w:r>
+          </w:p>
+        </w:tc>
+      </w:tr>
+      <w:tr>
+        <w:tc>
+          <w:tcPr/>
+          <w:p>
+            <w:pPr>
+              <w:pStyle w:val="Compact"/>
+              <w:jc w:val="left"/>
+            </w:pPr>
+            <w:r>
+              <w:rPr>
+                <w:rStyle w:val="VerbatimChar"/>
+              </w:rPr>
+              <w:t xml:space="preserve">FB2-HW-TSR-000003</w:t>
+            </w:r>
+          </w:p>
+        </w:tc>
+        <w:tc>
+          <w:tcPr/>
+          <w:p>
+            <w:pPr>
+              <w:pStyle w:val="Compact"/>
+              <w:jc w:val="left"/>
+            </w:pPr>
+            <w:r>
+              <w:rPr>
+                <w:rStyle w:val="VerbatimChar"/>
+              </w:rPr>
+              <w:t xml:space="preserve">FB2-SAF-FSR-000003</w:t>
+            </w:r>
+            <w:r>
+              <w:t xml:space="preserve"> </w:t>
+            </w:r>
+            <w:r>
+              <w:t xml:space="preserve">(</w:t>
+            </w:r>
+            <w:r>
+              <w:rPr>
+                <w:rStyle w:val="VerbatimChar"/>
+              </w:rPr>
+              <w:t xml:space="preserve">FB2-LNK-SAF-000007</w:t>
+            </w:r>
+            <w:r>
+              <w:t xml:space="preserve">)</w:t>
+            </w:r>
+          </w:p>
+        </w:tc>
+        <w:tc>
+          <w:tcPr/>
+          <w:p>
+            <w:pPr>
+              <w:pStyle w:val="Compact"/>
+              <w:jc w:val="left"/>
+            </w:pPr>
+            <w:r>
+              <w:rPr>
+                <w:rStyle w:val="VerbatimChar"/>
+              </w:rPr>
+              <w:t xml:space="preserve">FB2-VER-TMS-000005</w:t>
+            </w:r>
+            <w:r>
+              <w:t xml:space="preserve"> </w:t>
+            </w:r>
+            <w:r>
+              <w:t xml:space="preserve">(</w:t>
+            </w:r>
+            <w:r>
+              <w:rPr>
+                <w:rStyle w:val="VerbatimChar"/>
+              </w:rPr>
+              <w:t xml:space="preserve">FB2-LNK-SAF-000025</w:t>
+            </w:r>
+            <w:r>
+              <w:t xml:space="preserve">)</w:t>
+            </w:r>
+          </w:p>
+        </w:tc>
+        <w:tc>
+          <w:tcPr/>
+          <w:p>
+            <w:pPr>
+              <w:pStyle w:val="Compact"/>
+              <w:jc w:val="left"/>
+            </w:pPr>
+            <w:r>
+              <w:t xml:space="preserve">none recorded</w:t>
+            </w:r>
+          </w:p>
+        </w:tc>
+      </w:tr>
+    </w:tbl>
+    <w:bookmarkEnd w:id="48"/>
+    <w:bookmarkStart w:id="49" w:name="X7f7c1dc136b53ebff937497e3642b8ed21ce4e8"/>
+    <w:p>
+      <w:pPr>
+        <w:pStyle w:val="Heading3"/>
+      </w:pPr>
+      <w:r>
+        <w:t xml:space="preserve">Profile:</w:t>
+      </w:r>
+      <w:r>
+        <w:t xml:space="preserve"> </w:t>
+      </w:r>
+      <w:r>
+        <w:rPr>
+          <w:rStyle w:val="VerbatimChar"/>
+        </w:rPr>
+        <w:t xml:space="preserve">synthetic_reference</w:t>
+      </w:r>
+      <w:r>
+        <w:t xml:space="preserve"> </w:t>
+      </w:r>
+      <w:r>
+        <w:t xml:space="preserve">(test measures</w:t>
+      </w:r>
+      <w:r>
+        <w:t xml:space="preserve"> </w:t>
+      </w:r>
+      <w:r>
+        <w:rPr>
+          <w:rStyle w:val="VerbatimChar"/>
+        </w:rPr>
+        <w:t xml:space="preserve">synthetic_assumption</w:t>
+      </w:r>
+      <w:r>
+        <w:t xml:space="preserve">, executions</w:t>
+      </w:r>
+      <w:r>
+        <w:t xml:space="preserve"> </w:t>
+      </w:r>
+      <w:r>
+        <w:rPr>
+          <w:rStyle w:val="VerbatimChar"/>
+        </w:rPr>
+        <w:t xml:space="preserve">synthetic_fixture</w:t>
+      </w:r>
+      <w:r>
+        <w:t xml:space="preserve">)</w:t>
+      </w:r>
+    </w:p>
+    <w:tbl>
+      <w:tblPr>
+        <w:tblStyle w:val="Table"/>
+        <w:tblW w:type="pct" w:w="5000"/>
+        <w:jc w:val="left"/>
+        <w:tblLayout w:type="fixed"/>
+        <w:tblLook w:firstRow="1" w:lastRow="0" w:firstColumn="0" w:lastColumn="0" w:noHBand="0" w:noVBand="0" w:val="0020"/>
+      </w:tblPr>
+      <w:tblGrid>
+        <w:gridCol w:w="1980"/>
+        <w:gridCol w:w="1980"/>
+        <w:gridCol w:w="1980"/>
+        <w:gridCol w:w="1980"/>
+      </w:tblGrid>
+      <w:tr>
+        <w:trPr>
+          <w:tblHeader w:val="on"/>
+        </w:trPr>
+        <w:tc>
+          <w:tcPr/>
+          <w:p>
+            <w:pPr>
+              <w:pStyle w:val="Compact"/>
+              <w:jc w:val="left"/>
+            </w:pPr>
+            <w:r>
+              <w:t xml:space="preserve">SWR / TSR</w:t>
+            </w:r>
+          </w:p>
+        </w:tc>
+        <w:tc>
+          <w:tcPr/>
+          <w:p>
+            <w:pPr>
+              <w:pStyle w:val="Compact"/>
+              <w:jc w:val="left"/>
+            </w:pPr>
+            <w:r>
+              <w:t xml:space="preserve">Allocated to</w:t>
+            </w:r>
+          </w:p>
+        </w:tc>
+        <w:tc>
+          <w:tcPr/>
+          <w:p>
+            <w:pPr>
+              <w:pStyle w:val="Compact"/>
+              <w:jc w:val="left"/>
+            </w:pPr>
+            <w:r>
+              <w:t xml:space="preserve">Test measure (</w:t>
+            </w:r>
+            <w:r>
+              <w:rPr>
+                <w:rStyle w:val="VerbatimChar"/>
+              </w:rPr>
+              <w:t xml:space="preserve">verifies</w:t>
+            </w:r>
+            <w:r>
+              <w:t xml:space="preserve"> </w:t>
+            </w:r>
+            <w:r>
+              <w:t xml:space="preserve">links)</w:t>
+            </w:r>
+          </w:p>
+        </w:tc>
+        <w:tc>
+          <w:tcPr/>
+          <w:p>
+            <w:pPr>
+              <w:pStyle w:val="Compact"/>
+              <w:jc w:val="left"/>
+            </w:pPr>
+            <w:r>
+              <w:t xml:space="preserve">Execution record</w:t>
+            </w:r>
+          </w:p>
+        </w:tc>
+      </w:tr>
+      <w:tr>
+        <w:tc>
+          <w:tcPr/>
+          <w:p>
+            <w:pPr>
+              <w:pStyle w:val="Compact"/>
+              <w:jc w:val="left"/>
+            </w:pPr>
+            <w:r>
+              <w:rPr>
+                <w:rStyle w:val="VerbatimChar"/>
+              </w:rPr>
+              <w:t xml:space="preserve">FB2-SW-SWR-000001</w:t>
+            </w:r>
+          </w:p>
+        </w:tc>
+        <w:tc>
+          <w:tcPr/>
+          <w:p>
+            <w:pPr>
+              <w:pStyle w:val="Compact"/>
+              <w:jc w:val="left"/>
+            </w:pPr>
+            <w:r>
+              <w:rPr>
+                <w:rStyle w:val="VerbatimChar"/>
+              </w:rPr>
+              <w:t xml:space="preserve">FB2-SAF-FSR-000001</w:t>
+            </w:r>
+            <w:r>
+              <w:t xml:space="preserve"> </w:t>
+            </w:r>
+            <w:r>
+              <w:t xml:space="preserve">(</w:t>
+            </w:r>
+            <w:r>
+              <w:rPr>
+                <w:rStyle w:val="VerbatimChar"/>
+              </w:rPr>
+              <w:t xml:space="preserve">FB2-LNK-SAF-000008</w:t>
+            </w:r>
+            <w:r>
+              <w:t xml:space="preserve">)</w:t>
+            </w:r>
+          </w:p>
+        </w:tc>
+        <w:tc>
+          <w:tcPr/>
+          <w:p>
+            <w:pPr>
+              <w:pStyle w:val="Compact"/>
+              <w:jc w:val="left"/>
+            </w:pPr>
+            <w:r>
+              <w:rPr>
+                <w:rStyle w:val="VerbatimChar"/>
+              </w:rPr>
+              <w:t xml:space="preserve">FB2-VER-TMS-000003</w:t>
+            </w:r>
+            <w:r>
+              <w:t xml:space="preserve"> </w:t>
+            </w:r>
+            <w:r>
+              <w:t xml:space="preserve">(</w:t>
+            </w:r>
+            <w:r>
+              <w:rPr>
+                <w:rStyle w:val="VerbatimChar"/>
+              </w:rPr>
+              <w:t xml:space="preserve">FB2-LNK-SAF-000026</w:t>
+            </w:r>
+            <w:r>
+              <w:t xml:space="preserve">,</w:t>
+            </w:r>
+            <w:r>
+              <w:t xml:space="preserve"> </w:t>
+            </w:r>
+            <w:r>
+              <w:rPr>
+                <w:rStyle w:val="VerbatimChar"/>
+              </w:rPr>
+              <w:t xml:space="preserve">FB2-LNK-SAF-000027</w:t>
+            </w:r>
+            <w:r>
+              <w:t xml:space="preserve">, also</w:t>
+            </w:r>
+            <w:r>
+              <w:t xml:space="preserve"> </w:t>
+            </w:r>
+            <w:r>
+              <w:rPr>
+                <w:rStyle w:val="VerbatimChar"/>
+              </w:rPr>
+              <w:t xml:space="preserve">FB2-HW-TSR-000001</w:t>
+            </w:r>
+            <w:r>
+              <w:t xml:space="preserve"> </w:t>
+            </w:r>
+            <w:r>
+              <w:t xml:space="preserve">via</w:t>
+            </w:r>
+            <w:r>
+              <w:t xml:space="preserve"> </w:t>
+            </w:r>
+            <w:r>
+              <w:rPr>
+                <w:rStyle w:val="VerbatimChar"/>
+              </w:rPr>
+              <w:t xml:space="preserve">FB2-LNK-SAF-000028</w:t>
+            </w:r>
+            <w:r>
+              <w:t xml:space="preserve">)</w:t>
+            </w:r>
+          </w:p>
+        </w:tc>
+        <w:tc>
+          <w:tcPr/>
+          <w:p>
+            <w:pPr>
+              <w:pStyle w:val="Compact"/>
+              <w:jc w:val="left"/>
+            </w:pPr>
+            <w:r>
+              <w:rPr>
+                <w:rStyle w:val="VerbatimChar"/>
+              </w:rPr>
+              <w:t xml:space="preserve">FB2-VER-EXE-000003</w:t>
+            </w:r>
+            <w:r>
+              <w:t xml:space="preserve"> </w:t>
+            </w:r>
+            <w:r>
+              <w:t xml:space="preserve">(</w:t>
+            </w:r>
+            <w:r>
+              <w:rPr>
+                <w:rStyle w:val="VerbatimChar"/>
+              </w:rPr>
+              <w:t xml:space="preserve">FB2-LNK-SAF-000035</w:t>
+            </w:r>
+            <w:r>
+              <w:t xml:space="preserve">),</w:t>
+            </w:r>
+            <w:r>
+              <w:t xml:space="preserve"> </w:t>
+            </w:r>
+            <w:r>
+              <w:rPr>
+                <w:rStyle w:val="VerbatimChar"/>
+              </w:rPr>
+              <w:t xml:space="preserve">synthetic_fixture</w:t>
+            </w:r>
+            <w:r>
+              <w:t xml:space="preserve">,</w:t>
+            </w:r>
+            <w:r>
+              <w:t xml:space="preserve"> </w:t>
+            </w:r>
+            <w:r>
+              <w:rPr>
+                <w:rStyle w:val="VerbatimChar"/>
+              </w:rPr>
+              <w:t xml:space="preserve">pass</w:t>
+            </w:r>
+          </w:p>
+        </w:tc>
+      </w:tr>
+      <w:tr>
+        <w:tc>
+          <w:tcPr/>
+          <w:p>
+            <w:pPr>
+              <w:pStyle w:val="Compact"/>
+              <w:jc w:val="left"/>
+            </w:pPr>
+            <w:r>
+              <w:rPr>
+                <w:rStyle w:val="VerbatimChar"/>
+              </w:rPr>
+              <w:t xml:space="preserve">FB2-SW-SWR-000002</w:t>
+            </w:r>
+          </w:p>
+        </w:tc>
+        <w:tc>
+          <w:tcPr/>
+          <w:p>
+            <w:pPr>
+              <w:pStyle w:val="Compact"/>
+              <w:jc w:val="left"/>
+            </w:pPr>
+            <w:r>
+              <w:rPr>
+                <w:rStyle w:val="VerbatimChar"/>
+              </w:rPr>
+              <w:t xml:space="preserve">FB2-SAF-FSR-000002</w:t>
+            </w:r>
+            <w:r>
+              <w:t xml:space="preserve"> </w:t>
+            </w:r>
+            <w:r>
+              <w:t xml:space="preserve">(</w:t>
+            </w:r>
+            <w:r>
+              <w:rPr>
+                <w:rStyle w:val="VerbatimChar"/>
+              </w:rPr>
+              <w:t xml:space="preserve">FB2-LNK-SAF-000009</w:t>
+            </w:r>
+            <w:r>
+              <w:t xml:space="preserve">)</w:t>
+            </w:r>
+          </w:p>
+        </w:tc>
+        <w:tc>
+          <w:tcPr/>
+          <w:p>
+            <w:pPr>
+              <w:pStyle w:val="Compact"/>
+              <w:jc w:val="left"/>
+            </w:pPr>
+            <w:r>
+              <w:rPr>
+                <w:rStyle w:val="VerbatimChar"/>
+              </w:rPr>
+              <w:t xml:space="preserve">FB2-VER-TMS-000001</w:t>
+            </w:r>
+            <w:r>
+              <w:t xml:space="preserve"> </w:t>
+            </w:r>
+            <w:r>
+              <w:t xml:space="preserve">(</w:t>
+            </w:r>
+            <w:r>
+              <w:rPr>
+                <w:rStyle w:val="VerbatimChar"/>
+              </w:rPr>
+              <w:t xml:space="preserve">FB2-LNK-SAF-000022</w:t>
+            </w:r>
+            <w:r>
+              <w:t xml:space="preserve">,</w:t>
+            </w:r>
+            <w:r>
+              <w:t xml:space="preserve"> </w:t>
+            </w:r>
+            <w:r>
+              <w:rPr>
+                <w:rStyle w:val="VerbatimChar"/>
+              </w:rPr>
+              <w:t xml:space="preserve">FB2-LNK-SAF-000023</w:t>
+            </w:r>
+            <w:r>
+              <w:t xml:space="preserve">)</w:t>
+            </w:r>
+          </w:p>
+        </w:tc>
+        <w:tc>
+          <w:tcPr/>
+          <w:p>
+            <w:pPr>
+              <w:pStyle w:val="Compact"/>
+              <w:jc w:val="left"/>
+            </w:pPr>
+            <w:r>
+              <w:rPr>
+                <w:rStyle w:val="VerbatimChar"/>
+              </w:rPr>
+              <w:t xml:space="preserve">FB2-VER-EXE-000001</w:t>
+            </w:r>
+            <w:r>
+              <w:t xml:space="preserve"> </w:t>
+            </w:r>
+            <w:r>
+              <w:t xml:space="preserve">(</w:t>
+            </w:r>
+            <w:r>
+              <w:rPr>
+                <w:rStyle w:val="VerbatimChar"/>
+              </w:rPr>
+              <w:t xml:space="preserve">FB2-LNK-SAF-000033</w:t>
+            </w:r>
+            <w:r>
+              <w:t xml:space="preserve">),</w:t>
+            </w:r>
+            <w:r>
+              <w:t xml:space="preserve"> </w:t>
+            </w:r>
+            <w:r>
+              <w:rPr>
+                <w:rStyle w:val="VerbatimChar"/>
+              </w:rPr>
+              <w:t xml:space="preserve">synthetic_fixture</w:t>
+            </w:r>
+            <w:r>
+              <w:t xml:space="preserve">,</w:t>
+            </w:r>
+            <w:r>
+              <w:t xml:space="preserve"> </w:t>
+            </w:r>
+            <w:r>
+              <w:rPr>
+                <w:rStyle w:val="VerbatimChar"/>
+              </w:rPr>
+              <w:t xml:space="preserve">pass</w:t>
+            </w:r>
+          </w:p>
+        </w:tc>
+      </w:tr>
+      <w:tr>
+        <w:tc>
+          <w:tcPr/>
+          <w:p>
+            <w:pPr>
+              <w:pStyle w:val="Compact"/>
+              <w:jc w:val="left"/>
+            </w:pPr>
+            <w:r>
+              <w:rPr>
+                <w:rStyle w:val="VerbatimChar"/>
+              </w:rPr>
+              <w:t xml:space="preserve">FB2-SW-SWR-000003</w:t>
+            </w:r>
+          </w:p>
+        </w:tc>
+        <w:tc>
+          <w:tcPr/>
+          <w:p>
+            <w:pPr>
+              <w:pStyle w:val="Compact"/>
+              <w:jc w:val="left"/>
+            </w:pPr>
+            <w:r>
+              <w:rPr>
+                <w:rStyle w:val="VerbatimChar"/>
+              </w:rPr>
+              <w:t xml:space="preserve">FB2-SAF-FSR-000003</w:t>
+            </w:r>
+            <w:r>
+              <w:t xml:space="preserve"> </w:t>
+            </w:r>
+            <w:r>
+              <w:t xml:space="preserve">(</w:t>
+            </w:r>
+            <w:r>
+              <w:rPr>
+                <w:rStyle w:val="VerbatimChar"/>
+              </w:rPr>
+              <w:t xml:space="preserve">FB2-LNK-SAF-000010</w:t>
+            </w:r>
+            <w:r>
+              <w:t xml:space="preserve">)</w:t>
+            </w:r>
+          </w:p>
+        </w:tc>
+        <w:tc>
+          <w:tcPr/>
+          <w:p>
+            <w:pPr>
+              <w:pStyle w:val="Compact"/>
+              <w:jc w:val="left"/>
+            </w:pPr>
+            <w:r>
+              <w:rPr>
+                <w:rStyle w:val="VerbatimChar"/>
+              </w:rPr>
+              <w:t xml:space="preserve">FB2-VER-TMS-000002</w:t>
+            </w:r>
+            <w:r>
+              <w:t xml:space="preserve"> </w:t>
+            </w:r>
+            <w:r>
+              <w:t xml:space="preserve">(</w:t>
+            </w:r>
+            <w:r>
+              <w:rPr>
+                <w:rStyle w:val="VerbatimChar"/>
+              </w:rPr>
+              <w:t xml:space="preserve">FB2-LNK-SAF-000024</w:t>
+            </w:r>
+            <w:r>
+              <w:t xml:space="preserve">,</w:t>
+            </w:r>
+            <w:r>
+              <w:t xml:space="preserve"> </w:t>
+            </w:r>
+            <w:r>
+              <w:rPr>
+                <w:rStyle w:val="VerbatimChar"/>
+              </w:rPr>
+              <w:t xml:space="preserve">FB2-LNK-SAF-000025</w:t>
+            </w:r>
+            <w:r>
+              <w:t xml:space="preserve">)</w:t>
+            </w:r>
+          </w:p>
+        </w:tc>
+        <w:tc>
+          <w:tcPr/>
+          <w:p>
+            <w:pPr>
+              <w:pStyle w:val="Compact"/>
+              <w:jc w:val="left"/>
+            </w:pPr>
+            <w:r>
+              <w:rPr>
+                <w:rStyle w:val="VerbatimChar"/>
+              </w:rPr>
+              <w:t xml:space="preserve">FB2-VER-EXE-000002</w:t>
+            </w:r>
+            <w:r>
+              <w:t xml:space="preserve"> </w:t>
+            </w:r>
+            <w:r>
+              <w:t xml:space="preserve">(</w:t>
+            </w:r>
+            <w:r>
+              <w:rPr>
+                <w:rStyle w:val="VerbatimChar"/>
+              </w:rPr>
+              <w:t xml:space="preserve">FB2-LNK-SAF-000034</w:t>
+            </w:r>
+            <w:r>
+              <w:t xml:space="preserve">),</w:t>
+            </w:r>
+            <w:r>
+              <w:t xml:space="preserve"> </w:t>
+            </w:r>
+            <w:r>
+              <w:rPr>
+                <w:rStyle w:val="VerbatimChar"/>
+              </w:rPr>
+              <w:t xml:space="preserve">synthetic_fixture</w:t>
+            </w:r>
+            <w:r>
+              <w:t xml:space="preserve">,</w:t>
+            </w:r>
+            <w:r>
+              <w:t xml:space="preserve"> </w:t>
+            </w:r>
+            <w:r>
+              <w:rPr>
+                <w:rStyle w:val="VerbatimChar"/>
+              </w:rPr>
+              <w:t xml:space="preserve">pass</w:t>
+            </w:r>
+          </w:p>
+        </w:tc>
+      </w:tr>
+      <w:tr>
+        <w:tc>
+          <w:tcPr/>
+          <w:p>
+            <w:pPr>
+              <w:pStyle w:val="Compact"/>
+              <w:jc w:val="left"/>
+            </w:pPr>
+            <w:r>
+              <w:rPr>
+                <w:rStyle w:val="VerbatimChar"/>
+              </w:rPr>
+              <w:t xml:space="preserve">FB2-HW-TSR-000002</w:t>
+            </w:r>
+          </w:p>
+        </w:tc>
+        <w:tc>
+          <w:tcPr/>
+          <w:p>
+            <w:pPr>
+              <w:pStyle w:val="Compact"/>
+              <w:jc w:val="left"/>
+            </w:pPr>
+            <w:r>
+              <w:rPr>
+                <w:rStyle w:val="VerbatimChar"/>
+              </w:rPr>
+              <w:t xml:space="preserve">FB2-SAF-FSR-000001</w:t>
+            </w:r>
+            <w:r>
+              <w:t xml:space="preserve"> </w:t>
+            </w:r>
+            <w:r>
+              <w:t xml:space="preserve">(</w:t>
+            </w:r>
+            <w:r>
+              <w:rPr>
+                <w:rStyle w:val="VerbatimChar"/>
+              </w:rPr>
+              <w:t xml:space="preserve">FB2-LNK-SAF-000006</w:t>
+            </w:r>
+            <w:r>
+              <w:t xml:space="preserve">)</w:t>
+            </w:r>
+          </w:p>
+        </w:tc>
+        <w:tc>
+          <w:tcPr/>
+          <w:p>
+            <w:pPr>
+              <w:pStyle w:val="Compact"/>
+              <w:jc w:val="left"/>
+            </w:pPr>
+            <w:r>
+              <w:rPr>
+                <w:rStyle w:val="VerbatimChar"/>
+              </w:rPr>
+              <w:t xml:space="preserve">FB2-VER-TMS-000005</w:t>
+            </w:r>
+            <w:r>
+              <w:t xml:space="preserve"> </w:t>
+            </w:r>
+            <w:r>
+              <w:t xml:space="preserve">(</w:t>
+            </w:r>
+            <w:r>
+              <w:rPr>
+                <w:rStyle w:val="VerbatimChar"/>
+              </w:rPr>
+              <w:t xml:space="preserve">FB2-LNK-SAF-000031</w:t>
+            </w:r>
+            <w:r>
+              <w:t xml:space="preserve">)</w:t>
+            </w:r>
+          </w:p>
+        </w:tc>
+        <w:tc>
+          <w:tcPr/>
+          <w:p>
+            <w:pPr>
+              <w:pStyle w:val="Compact"/>
+              <w:jc w:val="left"/>
+            </w:pPr>
+            <w:r>
+              <w:rPr>
+                <w:rStyle w:val="VerbatimChar"/>
+              </w:rPr>
+              <w:t xml:space="preserve">FB2-VER-EXE-000005</w:t>
+            </w:r>
+            <w:r>
+              <w:t xml:space="preserve"> </w:t>
+            </w:r>
+            <w:r>
+              <w:t xml:space="preserve">(</w:t>
+            </w:r>
+            <w:r>
+              <w:rPr>
+                <w:rStyle w:val="VerbatimChar"/>
+              </w:rPr>
+              <w:t xml:space="preserve">FB2-LNK-SAF-000037</w:t>
+            </w:r>
+            <w:r>
+              <w:t xml:space="preserve">),</w:t>
+            </w:r>
+            <w:r>
+              <w:t xml:space="preserve"> </w:t>
+            </w:r>
+            <w:r>
+              <w:rPr>
+                <w:rStyle w:val="VerbatimChar"/>
+              </w:rPr>
+              <w:t xml:space="preserve">synthetic_fixture</w:t>
+            </w:r>
+            <w:r>
+              <w:t xml:space="preserve">,</w:t>
+            </w:r>
+            <w:r>
+              <w:t xml:space="preserve"> </w:t>
+            </w:r>
+            <w:r>
+              <w:rPr>
+                <w:rStyle w:val="VerbatimChar"/>
+              </w:rPr>
+              <w:t xml:space="preserve">pass</w:t>
+            </w:r>
+          </w:p>
+        </w:tc>
+      </w:tr>
+      <w:tr>
+        <w:tc>
+          <w:tcPr/>
+          <w:p>
+            <w:pPr>
+              <w:pStyle w:val="Compact"/>
+              <w:jc w:val="left"/>
+            </w:pPr>
+            <w:r>
+              <w:rPr>
+                <w:rStyle w:val="VerbatimChar"/>
+              </w:rPr>
+              <w:t xml:space="preserve">FB2-HW-TSR-000003</w:t>
+            </w:r>
+          </w:p>
+        </w:tc>
+        <w:tc>
+          <w:tcPr/>
+          <w:p>
+            <w:pPr>
+              <w:pStyle w:val="Compact"/>
+              <w:jc w:val="left"/>
+            </w:pPr>
+            <w:r>
+              <w:rPr>
+                <w:rStyle w:val="VerbatimChar"/>
+              </w:rPr>
+              <w:t xml:space="preserve">FB2-SAF-FSR-000003</w:t>
+            </w:r>
+            <w:r>
+              <w:t xml:space="preserve"> </w:t>
+            </w:r>
+            <w:r>
+              <w:t xml:space="preserve">(</w:t>
+            </w:r>
+            <w:r>
+              <w:rPr>
+                <w:rStyle w:val="VerbatimChar"/>
+              </w:rPr>
+              <w:t xml:space="preserve">FB2-LNK-SAF-000007</w:t>
+            </w:r>
+            <w:r>
+              <w:t xml:space="preserve">)</w:t>
+            </w:r>
+          </w:p>
+        </w:tc>
+        <w:tc>
+          <w:tcPr/>
+          <w:p>
+            <w:pPr>
+              <w:pStyle w:val="Compact"/>
+              <w:jc w:val="left"/>
+            </w:pPr>
+            <w:r>
+              <w:rPr>
+                <w:rStyle w:val="VerbatimChar"/>
+              </w:rPr>
+              <w:t xml:space="preserve">FB2-VER-TMS-000006</w:t>
+            </w:r>
+            <w:r>
+              <w:t xml:space="preserve"> </w:t>
+            </w:r>
+            <w:r>
+              <w:t xml:space="preserve">(</w:t>
+            </w:r>
+            <w:r>
+              <w:rPr>
+                <w:rStyle w:val="VerbatimChar"/>
+              </w:rPr>
+              <w:t xml:space="preserve">FB2-LNK-SAF-000032</w:t>
+            </w:r>
+            <w:r>
+              <w:t xml:space="preserve">)</w:t>
+            </w:r>
+          </w:p>
+        </w:tc>
+        <w:tc>
+          <w:tcPr/>
+          <w:p>
+            <w:pPr>
+              <w:pStyle w:val="Compact"/>
+              <w:jc w:val="left"/>
+            </w:pPr>
+            <w:r>
+              <w:rPr>
+                <w:rStyle w:val="VerbatimChar"/>
+              </w:rPr>
+              <w:t xml:space="preserve">FB2-VER-EXE-000006</w:t>
+            </w:r>
+            <w:r>
+              <w:t xml:space="preserve"> </w:t>
+            </w:r>
+            <w:r>
+              <w:t xml:space="preserve">(</w:t>
+            </w:r>
+            <w:r>
+              <w:rPr>
+                <w:rStyle w:val="VerbatimChar"/>
+              </w:rPr>
+              <w:t xml:space="preserve">FB2-LNK-SAF-000038</w:t>
+            </w:r>
+            <w:r>
+              <w:t xml:space="preserve">),</w:t>
+            </w:r>
+            <w:r>
+              <w:t xml:space="preserve"> </w:t>
+            </w:r>
+            <w:r>
+              <w:rPr>
+                <w:rStyle w:val="VerbatimChar"/>
+              </w:rPr>
+              <w:t xml:space="preserve">synthetic_fixture</w:t>
+            </w:r>
+            <w:r>
+              <w:t xml:space="preserve">,</w:t>
+            </w:r>
+            <w:r>
+              <w:t xml:space="preserve"> </w:t>
+            </w:r>
+            <w:r>
+              <w:rPr>
+                <w:rStyle w:val="VerbatimChar"/>
+              </w:rPr>
+              <w:t xml:space="preserve">pass</w:t>
+            </w:r>
+          </w:p>
+        </w:tc>
+      </w:tr>
+      <w:tr>
+        <w:tc>
+          <w:tcPr/>
+          <w:p>
+            <w:pPr>
+              <w:pStyle w:val="Compact"/>
+              <w:jc w:val="left"/>
+            </w:pPr>
+            <w:r>
+              <w:rPr>
+                <w:rStyle w:val="VerbatimChar"/>
+              </w:rPr>
+              <w:t xml:space="preserve">FB2-SAF-FSR-000004</w:t>
+            </w:r>
+            <w:r>
+              <w:t xml:space="preserve"> </w:t>
+            </w:r>
+            <w:r>
+              <w:t xml:space="preserve">/</w:t>
+            </w:r>
+            <w:r>
+              <w:t xml:space="preserve"> </w:t>
+            </w:r>
+            <w:r>
+              <w:rPr>
+                <w:rStyle w:val="VerbatimChar"/>
+              </w:rPr>
+              <w:t xml:space="preserve">FB2-HW-TSR-000004</w:t>
+            </w:r>
+          </w:p>
+        </w:tc>
+        <w:tc>
+          <w:tcPr/>
+          <w:p>
+            <w:pPr>
+              <w:pStyle w:val="Compact"/>
+              <w:jc w:val="left"/>
+            </w:pPr>
+            <w:r>
+              <w:t xml:space="preserve">refines</w:t>
+            </w:r>
+            <w:r>
+              <w:t xml:space="preserve"> </w:t>
+            </w:r>
+            <w:r>
+              <w:rPr>
+                <w:rStyle w:val="VerbatimChar"/>
+              </w:rPr>
+              <w:t xml:space="preserve">FB2-SAF-SGO-000001</w:t>
+            </w:r>
+            <w:r>
+              <w:t xml:space="preserve"> </w:t>
+            </w:r>
+            <w:r>
+              <w:t xml:space="preserve">(</w:t>
+            </w:r>
+            <w:r>
+              <w:rPr>
+                <w:rStyle w:val="VerbatimChar"/>
+              </w:rPr>
+              <w:t xml:space="preserve">FB2-LNK-SAF-000021</w:t>
+            </w:r>
+            <w:r>
+              <w:t xml:space="preserve">); no</w:t>
+            </w:r>
+            <w:r>
+              <w:t xml:space="preserve"> </w:t>
+            </w:r>
+            <w:r>
+              <w:rPr>
+                <w:rStyle w:val="VerbatimChar"/>
+              </w:rPr>
+              <w:t xml:space="preserve">allocated_to</w:t>
+            </w:r>
+            <w:r>
+              <w:t xml:space="preserve"> </w:t>
+            </w:r>
+            <w:r>
+              <w:t xml:space="preserve">link for TSR-004</w:t>
+            </w:r>
+          </w:p>
+        </w:tc>
+        <w:tc>
+          <w:tcPr/>
+          <w:p>
+            <w:pPr>
+              <w:pStyle w:val="Compact"/>
+              <w:jc w:val="left"/>
+            </w:pPr>
+            <w:r>
+              <w:rPr>
+                <w:rStyle w:val="VerbatimChar"/>
+              </w:rPr>
+              <w:t xml:space="preserve">FB2-VER-TMS-000004</w:t>
+            </w:r>
+            <w:r>
+              <w:t xml:space="preserve"> </w:t>
+            </w:r>
+            <w:r>
+              <w:t xml:space="preserve">(</w:t>
+            </w:r>
+            <w:r>
+              <w:rPr>
+                <w:rStyle w:val="VerbatimChar"/>
+              </w:rPr>
+              <w:t xml:space="preserve">FB2-LNK-SAF-000029</w:t>
+            </w:r>
+            <w:r>
+              <w:t xml:space="preserve">,</w:t>
+            </w:r>
+            <w:r>
+              <w:t xml:space="preserve"> </w:t>
+            </w:r>
+            <w:r>
+              <w:rPr>
+                <w:rStyle w:val="VerbatimChar"/>
+              </w:rPr>
+              <w:t xml:space="preserve">FB2-LNK-SAF-000030</w:t>
+            </w:r>
+            <w:r>
+              <w:t xml:space="preserve">)</w:t>
+            </w:r>
+          </w:p>
+        </w:tc>
+        <w:tc>
+          <w:tcPr/>
+          <w:p>
+            <w:pPr>
+              <w:pStyle w:val="Compact"/>
+              <w:jc w:val="left"/>
+            </w:pPr>
+            <w:r>
+              <w:rPr>
+                <w:rStyle w:val="VerbatimChar"/>
+              </w:rPr>
+              <w:t xml:space="preserve">FB2-VER-EXE-000004</w:t>
+            </w:r>
+            <w:r>
+              <w:t xml:space="preserve"> </w:t>
+            </w:r>
+            <w:r>
+              <w:t xml:space="preserve">(</w:t>
+            </w:r>
+            <w:r>
+              <w:rPr>
+                <w:rStyle w:val="VerbatimChar"/>
+              </w:rPr>
+              <w:t xml:space="preserve">FB2-LNK-SAF-000036</w:t>
+            </w:r>
+            <w:r>
+              <w:t xml:space="preserve">),</w:t>
+            </w:r>
+            <w:r>
+              <w:t xml:space="preserve"> </w:t>
+            </w:r>
+            <w:r>
+              <w:rPr>
+                <w:rStyle w:val="VerbatimChar"/>
+              </w:rPr>
+              <w:t xml:space="preserve">synthetic_fixture</w:t>
+            </w:r>
+            <w:r>
+              <w:t xml:space="preserve">,</w:t>
+            </w:r>
+            <w:r>
+              <w:t xml:space="preserve"> </w:t>
+            </w:r>
+            <w:r>
+              <w:rPr>
+                <w:rStyle w:val="VerbatimChar"/>
+              </w:rPr>
+              <w:t xml:space="preserve">pass</w:t>
+            </w:r>
+          </w:p>
+        </w:tc>
+      </w:tr>
+    </w:tbl>
+    <w:bookmarkEnd w:id="49"/>
+    <w:bookmarkStart w:id="50" w:name="evidence-limits"/>
+    <w:p>
+      <w:pPr>
+        <w:pStyle w:val="Heading3"/>
+      </w:pPr>
+      <w:r>
+        <w:t xml:space="preserve">Evidence limits</w:t>
+      </w:r>
+    </w:p>
+    <w:p>
+      <w:pPr>
+        <w:pStyle w:val="Compact"/>
+        <w:numPr>
+          <w:ilvl w:val="0"/>
+          <w:numId w:val="1030"/>
+        </w:numPr>
+      </w:pPr>
+      <w:r>
+        <w:rPr>
+          <w:rStyle w:val="VerbatimChar"/>
+        </w:rPr>
+        <w:t xml:space="preserve">synthetic_fixture</w:t>
+      </w:r>
+      <w:r>
+        <w:t xml:space="preserve"> </w:t>
+      </w:r>
+      <w:r>
+        <w:rPr>
+          <w:rStyle w:val="VerbatimChar"/>
+        </w:rPr>
+        <w:t xml:space="preserve">pass</w:t>
+      </w:r>
+      <w:r>
+        <w:t xml:space="preserve"> </w:t>
+      </w:r>
+      <w:r>
+        <w:t xml:space="preserve">results demonstrate corpus structure, not independently verified test execution;</w:t>
+      </w:r>
+      <w:r>
+        <w:t xml:space="preserve"> </w:t>
+      </w:r>
+      <w:r>
+        <w:rPr>
+          <w:rStyle w:val="VerbatimChar"/>
+        </w:rPr>
+        <w:t xml:space="preserve">product_verification_credit</w:t>
+      </w:r>
+      <w:r>
+        <w:t xml:space="preserve"> </w:t>
+      </w:r>
+      <w:r>
+        <w:t xml:space="preserve">is</w:t>
+      </w:r>
+      <w:r>
+        <w:t xml:space="preserve"> </w:t>
+      </w:r>
+      <w:r>
+        <w:rPr>
+          <w:rStyle w:val="VerbatimChar"/>
+        </w:rPr>
+        <w:t xml:space="preserve">false</w:t>
+      </w:r>
+      <w:r>
+        <w:t xml:space="preserve"> </w:t>
+      </w:r>
+      <w:r>
+        <w:t xml:space="preserve">and</w:t>
+      </w:r>
+      <w:r>
+        <w:t xml:space="preserve"> </w:t>
+      </w:r>
+      <w:r>
+        <w:rPr>
+          <w:rStyle w:val="VerbatimChar"/>
+        </w:rPr>
+        <w:t xml:space="preserve">human_approval_status</w:t>
+      </w:r>
+      <w:r>
+        <w:t xml:space="preserve"> </w:t>
+      </w:r>
+      <w:r>
+        <w:t xml:space="preserve">is</w:t>
+      </w:r>
+      <w:r>
+        <w:t xml:space="preserve"> </w:t>
+      </w:r>
+      <w:r>
+        <w:rPr>
+          <w:rStyle w:val="VerbatimChar"/>
+        </w:rPr>
+        <w:t xml:space="preserve">pending</w:t>
+      </w:r>
+      <w:r>
+        <w:t xml:space="preserve"> </w:t>
+      </w:r>
+      <w:r>
+        <w:t xml:space="preserve">on these records.</w:t>
+      </w:r>
+    </w:p>
+    <w:p>
+      <w:pPr>
+        <w:pStyle w:val="Compact"/>
+        <w:numPr>
+          <w:ilvl w:val="0"/>
+          <w:numId w:val="1030"/>
+        </w:numPr>
+      </w:pPr>
+      <w:r>
+        <w:t xml:space="preserve">In</w:t>
+      </w:r>
+      <w:r>
+        <w:t xml:space="preserve"> </w:t>
+      </w:r>
+      <w:r>
+        <w:rPr>
+          <w:rStyle w:val="VerbatimChar"/>
+        </w:rPr>
+        <w:t xml:space="preserve">as_is</w:t>
+      </w:r>
+      <w:r>
+        <w:t xml:space="preserve">, only</w:t>
+      </w:r>
+      <w:r>
+        <w:t xml:space="preserve"> </w:t>
+      </w:r>
+      <w:r>
+        <w:rPr>
+          <w:rStyle w:val="VerbatimChar"/>
+        </w:rPr>
+        <w:t xml:space="preserve">FB2-VER-TMS-000001</w:t>
+      </w:r>
+      <w:r>
+        <w:t xml:space="preserve"> </w:t>
+      </w:r>
+      <w:r>
+        <w:t xml:space="preserve">has an execution record;</w:t>
+      </w:r>
+      <w:r>
+        <w:t xml:space="preserve"> </w:t>
+      </w:r>
+      <w:r>
+        <w:rPr>
+          <w:rStyle w:val="VerbatimChar"/>
+        </w:rPr>
+        <w:t xml:space="preserve">FB2-VER-TMS-000002</w:t>
+      </w:r>
+      <w:r>
+        <w:t xml:space="preserve"> </w:t>
+      </w:r>
+      <w:r>
+        <w:t xml:space="preserve">through</w:t>
+      </w:r>
+      <w:r>
+        <w:t xml:space="preserve"> </w:t>
+      </w:r>
+      <w:r>
+        <w:rPr>
+          <w:rStyle w:val="VerbatimChar"/>
+        </w:rPr>
+        <w:t xml:space="preserve">FB2-VER-TMS-000005</w:t>
+      </w:r>
+      <w:r>
+        <w:t xml:space="preserve"> </w:t>
+      </w:r>
+      <w:r>
+        <w:t xml:space="preserve">have no execution records — no execution credit is inferred for them. The single</w:t>
+      </w:r>
+      <w:r>
+        <w:t xml:space="preserve"> </w:t>
+      </w:r>
+      <w:r>
+        <w:rPr>
+          <w:rStyle w:val="VerbatimChar"/>
+        </w:rPr>
+        <w:t xml:space="preserve">actual_host_run</w:t>
+      </w:r>
+      <w:r>
+        <w:t xml:space="preserve"> </w:t>
+      </w:r>
+      <w:r>
+        <w:t xml:space="preserve">pass is not independently substantiated (placeholder hashes, empty</w:t>
+      </w:r>
+      <w:r>
+        <w:t xml:space="preserve"> </w:t>
+      </w:r>
+      <w:r>
+        <w:rPr>
+          <w:rStyle w:val="VerbatimChar"/>
+        </w:rPr>
+        <w:t xml:space="preserve">output_hashes</w:t>
+      </w:r>
+      <w:r>
+        <w:t xml:space="preserve">, no retained per-run logs).</w:t>
       </w:r>
     </w:p>
     <w:p>
@@ -5442,10 +8559,9 @@
         <w:t xml:space="preserve">.</w:t>
       </w:r>
     </w:p>
-    <w:bookmarkEnd w:id="41"/>
-    <w:bookmarkEnd w:id="42"/>
-    <w:bookmarkEnd w:id="43"/>
-    <w:bookmarkEnd w:id="44"/>
+    <w:bookmarkEnd w:id="50"/>
+    <w:bookmarkEnd w:id="51"/>
+    <w:bookmarkEnd w:id="52"/>
     <w:sectPr/>
   </w:body>
 </w:document>
@@ -5704,6 +8820,21 @@
     <w:abstractNumId w:val="991"/>
   </w:num>
   <w:num w:numId="1025">
+    <w:abstractNumId w:val="991"/>
+  </w:num>
+  <w:num w:numId="1026">
+    <w:abstractNumId w:val="991"/>
+  </w:num>
+  <w:num w:numId="1027">
+    <w:abstractNumId w:val="991"/>
+  </w:num>
+  <w:num w:numId="1028">
+    <w:abstractNumId w:val="991"/>
+  </w:num>
+  <w:num w:numId="1029">
+    <w:abstractNumId w:val="991"/>
+  </w:num>
+  <w:num w:numId="1030">
     <w:abstractNumId w:val="991"/>
   </w:num>
 </w:numbering>

</xml_diff>

<commit_message>
docs(corpus): TSR-004 allocation link LNK-058; gap notes settled
- FB2-LNK-SAF-000058 allocated_to TSR-000004 -> FSR-000004 in both
  registries (80 links, 0 dangling)
- FSR-004/TSR-004 gap notes updated in SRS, impl-mapping,
  chain-map, process-map, evidence-report, TRACEABILITY_DOCUMENT
- coverage counts synced (80/80, 55 synthetic links)
- DOCX 04/10 rebuilt; corpus check PASSED
</commit_message>
<xml_diff>
--- a/docs/artifacts/spec-documents/04-software-requirements-specification.docx
+++ b/docs/artifacts/spec-documents/04-software-requirements-specification.docx
@@ -23,7 +23,7 @@
         <w:pStyle w:val="Date"/>
       </w:pPr>
       <w:r>
-        <w:t xml:space="preserve">2026-09-18</w:t>
+        <w:t xml:space="preserve">2026-09-20</w:t>
       </w:r>
     </w:p>
     <w:sdt>
@@ -5805,55 +5805,71 @@
           <w:b/>
           <w:bCs/>
         </w:rPr>
+        <w:t xml:space="preserve">Allocated to</w:t>
+      </w:r>
+      <w:r>
+        <w:t xml:space="preserve">:</w:t>
+      </w:r>
+      <w:r>
+        <w:t xml:space="preserve"> </w:t>
+      </w:r>
+      <w:r>
+        <w:rPr>
+          <w:rStyle w:val="VerbatimChar"/>
+        </w:rPr>
+        <w:t xml:space="preserve">FB2-SAF-FSR-000004</w:t>
+      </w:r>
+      <w:r>
+        <w:t xml:space="preserve"> </w:t>
+      </w:r>
+      <w:r>
+        <w:t xml:space="preserve">(link</w:t>
+      </w:r>
+      <w:r>
+        <w:t xml:space="preserve"> </w:t>
+      </w:r>
+      <w:r>
+        <w:rPr>
+          <w:rStyle w:val="VerbatimChar"/>
+        </w:rPr>
+        <w:t xml:space="preserve">FB2-LNK-SAF-000058</w:t>
+      </w:r>
+      <w:r>
+        <w:t xml:space="preserve">, rationale:</w:t>
+      </w:r>
+      <w:r>
+        <w:t xml:space="preserve"> </w:t>
+      </w:r>
+      <w:r>
+        <w:t xml:space="preserve">“</w:t>
+      </w:r>
+      <w:r>
+        <w:t xml:space="preserve">Hardware requirement allocated from functional safety requirement</w:t>
+      </w:r>
+      <w:r>
+        <w:t xml:space="preserve">”</w:t>
+      </w:r>
+      <w:r>
+        <w:t xml:space="preserve">)</w:t>
+      </w:r>
+    </w:p>
+    <w:p>
+      <w:pPr>
+        <w:pStyle w:val="Compact"/>
+        <w:numPr>
+          <w:ilvl w:val="0"/>
+          <w:numId w:val="1027"/>
+        </w:numPr>
+      </w:pPr>
+      <w:r>
+        <w:rPr>
+          <w:b/>
+          <w:bCs/>
+        </w:rPr>
         <w:t xml:space="preserve">Note</w:t>
       </w:r>
       <w:r>
-        <w:t xml:space="preserve">: no</w:t>
-      </w:r>
-      <w:r>
-        <w:t xml:space="preserve"> </w:t>
-      </w:r>
-      <w:r>
-        <w:rPr>
-          <w:rStyle w:val="VerbatimChar"/>
-        </w:rPr>
-        <w:t xml:space="preserve">allocated_to</w:t>
-      </w:r>
-      <w:r>
-        <w:t xml:space="preserve"> </w:t>
-      </w:r>
-      <w:r>
-        <w:t xml:space="preserve">link from</w:t>
-      </w:r>
-      <w:r>
-        <w:t xml:space="preserve"> </w:t>
-      </w:r>
-      <w:r>
-        <w:rPr>
-          <w:rStyle w:val="VerbatimChar"/>
-        </w:rPr>
-        <w:t xml:space="preserve">FB2-HW-TSR-000004</w:t>
-      </w:r>
-      <w:r>
-        <w:t xml:space="preserve"> </w:t>
-      </w:r>
-      <w:r>
-        <w:t xml:space="preserve">to</w:t>
-      </w:r>
-      <w:r>
-        <w:t xml:space="preserve"> </w:t>
-      </w:r>
-      <w:r>
-        <w:rPr>
-          <w:rStyle w:val="VerbatimChar"/>
-        </w:rPr>
-        <w:t xml:space="preserve">FB2-SAF-FSR-000004</w:t>
-      </w:r>
-      <w:r>
-        <w:t xml:space="preserve"> </w:t>
-      </w:r>
-      <w:r>
-        <w:t xml:space="preserve">exists in the link registry; both are verified by</w:t>
+        <w:t xml:space="preserve">: both are verified by</w:t>
       </w:r>
       <w:r>
         <w:t xml:space="preserve"> </w:t>
@@ -8208,7 +8224,7 @@
               <w:t xml:space="preserve">FB2-LNK-SAF-000021</w:t>
             </w:r>
             <w:r>
-              <w:t xml:space="preserve">); no</w:t>
+              <w:t xml:space="preserve">); TSR-004</w:t>
             </w:r>
             <w:r>
               <w:t xml:space="preserve"> </w:t>
@@ -8223,7 +8239,16 @@
               <w:t xml:space="preserve"> </w:t>
             </w:r>
             <w:r>
-              <w:t xml:space="preserve">link for TSR-004</w:t>
+              <w:t xml:space="preserve">FSR-004 (</w:t>
+            </w:r>
+            <w:r>
+              <w:rPr>
+                <w:rStyle w:val="VerbatimChar"/>
+              </w:rPr>
+              <w:t xml:space="preserve">FB2-LNK-SAF-000058</w:t>
+            </w:r>
+            <w:r>
+              <w:t xml:space="preserve">)</w:t>
             </w:r>
           </w:p>
         </w:tc>

</xml_diff>